<commit_message>
Deney 2 raporu: SPICE sonuçları, tek yazar, tarih 20.10.2026
</commit_message>
<xml_diff>
--- a/ele201l_deney2_lab/build/ELE201L_Deney2_Laboratuvar_Raporu.docx
+++ b/ele201l_deney2_lab/build/ELE201L_Deney2_Laboratuvar_Raporu.docx
@@ -173,7 +173,6 @@
                 <w:b w:val="0"/>
                 <w:sz w:val="26"/>
               </w:rPr>
-              <w:t>Işıl Fidancan / Bahar Işıklar / Beşir Kerem Üstüntürk</w:t>
             </w:r>
           </w:p>
         </w:tc>
@@ -223,7 +222,6 @@
                 <w:b w:val="0"/>
                 <w:sz w:val="26"/>
               </w:rPr>
-              <w:t>251201045 / 241201036 / 251201037</w:t>
             </w:r>
           </w:p>
         </w:tc>
@@ -273,6 +271,7 @@
                 <w:b w:val="0"/>
                 <w:sz w:val="26"/>
               </w:rPr>
+              <w:t>20.10.2026</w:t>
             </w:r>
           </w:p>
         </w:tc>
@@ -590,7 +589,7 @@
           <w:b w:val="0"/>
           <w:i w:val="0"/>
         </w:rPr>
-        <w:t xml:space="preserve"> alınmıştır.</w:t>
+        <w:t xml:space="preserve"> alınmıştır. Devre açık devre ve kısa devre koşullarında ngspice ile analiz edilmiş, sonuçlar tablolarda SPICE sütununda verilmiştir.</w:t>
       </w:r>
     </w:p>
     <w:p>
@@ -2203,7 +2202,7 @@
           <w:i w:val="0"/>
           <w:sz w:val="20"/>
         </w:rPr>
-        <w:t>Tablo 4.1.1  Thevenin eşdeğeri için teorik değerler (Şekil 1)</w:t>
+        <w:t>Tablo 4.1.1  Thevenin eşdeğeri için teorik ve SPICE değerleri (Şekil 1)</w:t>
       </w:r>
     </w:p>
     <w:tbl>
@@ -2214,9 +2213,10 @@
         <w:tblLook w:firstColumn="1" w:firstRow="1" w:lastColumn="0" w:lastRow="0" w:noHBand="0" w:noVBand="1" w:val="04A0"/>
       </w:tblPr>
       <w:tblGrid>
-        <w:gridCol w:w="3969"/>
-        <w:gridCol w:w="1984"/>
-        <w:gridCol w:w="2268"/>
+        <w:gridCol w:w="3515"/>
+        <w:gridCol w:w="1814"/>
+        <w:gridCol w:w="1814"/>
+        <w:gridCol w:w="1814"/>
       </w:tblGrid>
       <w:tr>
         <w:trPr>
@@ -2225,7 +2225,7 @@
         </w:trPr>
         <w:tc>
           <w:tcPr>
-            <w:tcW w:type="dxa" w:w="3969"/>
+            <w:tcW w:type="dxa" w:w="3515"/>
             <w:tcBorders>
               <w:top w:val="single" w:sz="4" w:space="0" w:color="000000"/>
               <w:left w:val="single" w:sz="4" w:space="0" w:color="000000"/>
@@ -2253,7 +2253,7 @@
         </w:tc>
         <w:tc>
           <w:tcPr>
-            <w:tcW w:type="dxa" w:w="1984"/>
+            <w:tcW w:type="dxa" w:w="1814"/>
             <w:tcBorders>
               <w:top w:val="single" w:sz="4" w:space="0" w:color="000000"/>
               <w:left w:val="single" w:sz="4" w:space="0" w:color="000000"/>
@@ -2281,7 +2281,7 @@
         </w:tc>
         <w:tc>
           <w:tcPr>
-            <w:tcW w:type="dxa" w:w="2268"/>
+            <w:tcW w:type="dxa" w:w="1814"/>
             <w:tcBorders>
               <w:top w:val="single" w:sz="4" w:space="0" w:color="000000"/>
               <w:left w:val="single" w:sz="4" w:space="0" w:color="000000"/>
@@ -2303,7 +2303,35 @@
                 <w:i w:val="0"/>
                 <w:sz w:val="20"/>
               </w:rPr>
-              <w:t>Simülasyon / ölçüm</w:t>
+              <w:t>SPICE</w:t>
+            </w:r>
+          </w:p>
+        </w:tc>
+        <w:tc>
+          <w:tcPr>
+            <w:tcW w:type="dxa" w:w="1814"/>
+            <w:tcBorders>
+              <w:top w:val="single" w:sz="4" w:space="0" w:color="000000"/>
+              <w:left w:val="single" w:sz="4" w:space="0" w:color="000000"/>
+              <w:bottom w:val="single" w:sz="4" w:space="0" w:color="000000"/>
+              <w:right w:val="single" w:sz="4" w:space="0" w:color="000000"/>
+            </w:tcBorders>
+            <w:shd w:val="clear" w:color="auto" w:fill="D9D9D9"/>
+          </w:tcPr>
+          <w:p>
+            <w:pPr>
+              <w:keepNext/>
+              <w:spacing w:line="240" w:lineRule="auto" w:after="20"/>
+              <w:jc w:val="center"/>
+            </w:pPr>
+            <w:r>
+              <w:rPr>
+                <w:rFonts w:ascii="Times New Roman" w:hAnsi="Times New Roman" w:cs="Times New Roman" w:eastAsia="Times New Roman"/>
+                <w:b/>
+                <w:i w:val="0"/>
+                <w:sz w:val="20"/>
+              </w:rPr>
+              <w:t>Ölçüm</w:t>
             </w:r>
           </w:p>
         </w:tc>
@@ -2314,7 +2342,7 @@
         </w:trPr>
         <w:tc>
           <w:tcPr>
-            <w:tcW w:type="dxa" w:w="3969"/>
+            <w:tcW w:type="dxa" w:w="3515"/>
             <w:tcBorders>
               <w:top w:val="single" w:sz="4" w:space="0" w:color="000000"/>
               <w:left w:val="single" w:sz="4" w:space="0" w:color="000000"/>
@@ -2358,7 +2386,7 @@
         </w:tc>
         <w:tc>
           <w:tcPr>
-            <w:tcW w:type="dxa" w:w="1984"/>
+            <w:tcW w:type="dxa" w:w="1814"/>
             <w:tcBorders>
               <w:top w:val="single" w:sz="4" w:space="0" w:color="000000"/>
               <w:left w:val="single" w:sz="4" w:space="0" w:color="000000"/>
@@ -2385,7 +2413,34 @@
         </w:tc>
         <w:tc>
           <w:tcPr>
-            <w:tcW w:type="dxa" w:w="2268"/>
+            <w:tcW w:type="dxa" w:w="1814"/>
+            <w:tcBorders>
+              <w:top w:val="single" w:sz="4" w:space="0" w:color="000000"/>
+              <w:left w:val="single" w:sz="4" w:space="0" w:color="000000"/>
+              <w:bottom w:val="single" w:sz="4" w:space="0" w:color="000000"/>
+              <w:right w:val="single" w:sz="4" w:space="0" w:color="000000"/>
+            </w:tcBorders>
+          </w:tcPr>
+          <w:p>
+            <w:pPr>
+              <w:keepNext/>
+              <w:spacing w:line="240" w:lineRule="auto" w:after="20"/>
+              <w:jc w:val="center"/>
+            </w:pPr>
+            <w:r>
+              <w:rPr>
+                <w:rFonts w:ascii="Times New Roman" w:hAnsi="Times New Roman" w:cs="Times New Roman" w:eastAsia="Times New Roman"/>
+                <w:b w:val="0"/>
+                <w:i w:val="0"/>
+                <w:sz w:val="20"/>
+              </w:rPr>
+              <w:t>6,00</w:t>
+            </w:r>
+          </w:p>
+        </w:tc>
+        <w:tc>
+          <w:tcPr>
+            <w:tcW w:type="dxa" w:w="1814"/>
             <w:tcBorders>
               <w:top w:val="single" w:sz="4" w:space="0" w:color="000000"/>
               <w:left w:val="single" w:sz="4" w:space="0" w:color="000000"/>
@@ -2417,7 +2472,7 @@
         </w:trPr>
         <w:tc>
           <w:tcPr>
-            <w:tcW w:type="dxa" w:w="3969"/>
+            <w:tcW w:type="dxa" w:w="3515"/>
             <w:tcBorders>
               <w:top w:val="single" w:sz="4" w:space="0" w:color="000000"/>
               <w:left w:val="single" w:sz="4" w:space="0" w:color="000000"/>
@@ -2461,7 +2516,7 @@
         </w:tc>
         <w:tc>
           <w:tcPr>
-            <w:tcW w:type="dxa" w:w="1984"/>
+            <w:tcW w:type="dxa" w:w="1814"/>
             <w:tcBorders>
               <w:top w:val="single" w:sz="4" w:space="0" w:color="000000"/>
               <w:left w:val="single" w:sz="4" w:space="0" w:color="000000"/>
@@ -2488,7 +2543,34 @@
         </w:tc>
         <w:tc>
           <w:tcPr>
-            <w:tcW w:type="dxa" w:w="2268"/>
+            <w:tcW w:type="dxa" w:w="1814"/>
+            <w:tcBorders>
+              <w:top w:val="single" w:sz="4" w:space="0" w:color="000000"/>
+              <w:left w:val="single" w:sz="4" w:space="0" w:color="000000"/>
+              <w:bottom w:val="single" w:sz="4" w:space="0" w:color="000000"/>
+              <w:right w:val="single" w:sz="4" w:space="0" w:color="000000"/>
+            </w:tcBorders>
+          </w:tcPr>
+          <w:p>
+            <w:pPr>
+              <w:keepNext/>
+              <w:spacing w:line="240" w:lineRule="auto" w:after="20"/>
+              <w:jc w:val="center"/>
+            </w:pPr>
+            <w:r>
+              <w:rPr>
+                <w:rFonts w:ascii="Times New Roman" w:hAnsi="Times New Roman" w:cs="Times New Roman" w:eastAsia="Times New Roman"/>
+                <w:b w:val="0"/>
+                <w:i w:val="0"/>
+                <w:sz w:val="20"/>
+              </w:rPr>
+              <w:t>1,705</w:t>
+            </w:r>
+          </w:p>
+        </w:tc>
+        <w:tc>
+          <w:tcPr>
+            <w:tcW w:type="dxa" w:w="1814"/>
             <w:tcBorders>
               <w:top w:val="single" w:sz="4" w:space="0" w:color="000000"/>
               <w:left w:val="single" w:sz="4" w:space="0" w:color="000000"/>
@@ -2520,7 +2602,7 @@
         </w:trPr>
         <w:tc>
           <w:tcPr>
-            <w:tcW w:type="dxa" w:w="3969"/>
+            <w:tcW w:type="dxa" w:w="3515"/>
             <w:tcBorders>
               <w:top w:val="single" w:sz="4" w:space="0" w:color="000000"/>
               <w:left w:val="single" w:sz="4" w:space="0" w:color="000000"/>
@@ -2606,7 +2688,7 @@
         </w:tc>
         <w:tc>
           <w:tcPr>
-            <w:tcW w:type="dxa" w:w="1984"/>
+            <w:tcW w:type="dxa" w:w="1814"/>
             <w:tcBorders>
               <w:top w:val="single" w:sz="4" w:space="0" w:color="000000"/>
               <w:left w:val="single" w:sz="4" w:space="0" w:color="000000"/>
@@ -2633,7 +2715,34 @@
         </w:tc>
         <w:tc>
           <w:tcPr>
-            <w:tcW w:type="dxa" w:w="2268"/>
+            <w:tcW w:type="dxa" w:w="1814"/>
+            <w:tcBorders>
+              <w:top w:val="single" w:sz="4" w:space="0" w:color="000000"/>
+              <w:left w:val="single" w:sz="4" w:space="0" w:color="000000"/>
+              <w:bottom w:val="single" w:sz="4" w:space="0" w:color="000000"/>
+              <w:right w:val="single" w:sz="4" w:space="0" w:color="000000"/>
+            </w:tcBorders>
+          </w:tcPr>
+          <w:p>
+            <w:pPr>
+              <w:keepNext/>
+              <w:spacing w:line="240" w:lineRule="auto" w:after="20"/>
+              <w:jc w:val="center"/>
+            </w:pPr>
+            <w:r>
+              <w:rPr>
+                <w:rFonts w:ascii="Times New Roman" w:hAnsi="Times New Roman" w:cs="Times New Roman" w:eastAsia="Times New Roman"/>
+                <w:b w:val="0"/>
+                <w:i w:val="0"/>
+                <w:sz w:val="20"/>
+              </w:rPr>
+              <w:t>3,52</w:t>
+            </w:r>
+          </w:p>
+        </w:tc>
+        <w:tc>
+          <w:tcPr>
+            <w:tcW w:type="dxa" w:w="1814"/>
             <w:tcBorders>
               <w:top w:val="single" w:sz="4" w:space="0" w:color="000000"/>
               <w:left w:val="single" w:sz="4" w:space="0" w:color="000000"/>
@@ -2665,7 +2774,7 @@
         </w:trPr>
         <w:tc>
           <w:tcPr>
-            <w:tcW w:type="dxa" w:w="3969"/>
+            <w:tcW w:type="dxa" w:w="3515"/>
             <w:tcBorders>
               <w:top w:val="single" w:sz="4" w:space="0" w:color="000000"/>
               <w:left w:val="single" w:sz="4" w:space="0" w:color="000000"/>
@@ -2709,7 +2818,7 @@
         </w:tc>
         <w:tc>
           <w:tcPr>
-            <w:tcW w:type="dxa" w:w="1984"/>
+            <w:tcW w:type="dxa" w:w="1814"/>
             <w:tcBorders>
               <w:top w:val="single" w:sz="4" w:space="0" w:color="000000"/>
               <w:left w:val="single" w:sz="4" w:space="0" w:color="000000"/>
@@ -2736,7 +2845,34 @@
         </w:tc>
         <w:tc>
           <w:tcPr>
-            <w:tcW w:type="dxa" w:w="2268"/>
+            <w:tcW w:type="dxa" w:w="1814"/>
+            <w:tcBorders>
+              <w:top w:val="single" w:sz="4" w:space="0" w:color="000000"/>
+              <w:left w:val="single" w:sz="4" w:space="0" w:color="000000"/>
+              <w:bottom w:val="single" w:sz="4" w:space="0" w:color="000000"/>
+              <w:right w:val="single" w:sz="4" w:space="0" w:color="000000"/>
+            </w:tcBorders>
+          </w:tcPr>
+          <w:p>
+            <w:pPr>
+              <w:keepNext w:val="0"/>
+              <w:spacing w:line="240" w:lineRule="auto" w:after="20"/>
+              <w:jc w:val="center"/>
+            </w:pPr>
+            <w:r>
+              <w:rPr>
+                <w:rFonts w:ascii="Times New Roman" w:hAnsi="Times New Roman" w:cs="Times New Roman" w:eastAsia="Times New Roman"/>
+                <w:b w:val="0"/>
+                <w:i w:val="0"/>
+                <w:sz w:val="20"/>
+              </w:rPr>
+              <w:t>3,52</w:t>
+            </w:r>
+          </w:p>
+        </w:tc>
+        <w:tc>
+          <w:tcPr>
+            <w:tcW w:type="dxa" w:w="1814"/>
             <w:tcBorders>
               <w:top w:val="single" w:sz="4" w:space="0" w:color="000000"/>
               <w:left w:val="single" w:sz="4" w:space="0" w:color="000000"/>
@@ -4004,7 +4140,7 @@
           <w:i w:val="0"/>
           <w:sz w:val="20"/>
         </w:rPr>
-        <w:t>Tablo 4.2.1  Maksimum güç transferi için teorik değerler (</w:t>
+        <w:t>Tablo 4.2.1  Maksimum güç transferi için teorik ve SPICE değerleri (</w:t>
       </w:r>
       <m:oMath>
         <m:sSub>
@@ -4059,9 +4195,10 @@
         <w:tblLook w:firstColumn="1" w:firstRow="1" w:lastColumn="0" w:lastRow="0" w:noHBand="0" w:noVBand="1" w:val="04A0"/>
       </w:tblPr>
       <w:tblGrid>
-        <w:gridCol w:w="3969"/>
-        <w:gridCol w:w="1984"/>
-        <w:gridCol w:w="2268"/>
+        <w:gridCol w:w="3515"/>
+        <w:gridCol w:w="1814"/>
+        <w:gridCol w:w="1814"/>
+        <w:gridCol w:w="1814"/>
       </w:tblGrid>
       <w:tr>
         <w:trPr>
@@ -4070,7 +4207,7 @@
         </w:trPr>
         <w:tc>
           <w:tcPr>
-            <w:tcW w:type="dxa" w:w="3969"/>
+            <w:tcW w:type="dxa" w:w="3515"/>
             <w:tcBorders>
               <w:top w:val="single" w:sz="4" w:space="0" w:color="000000"/>
               <w:left w:val="single" w:sz="4" w:space="0" w:color="000000"/>
@@ -4098,7 +4235,7 @@
         </w:tc>
         <w:tc>
           <w:tcPr>
-            <w:tcW w:type="dxa" w:w="1984"/>
+            <w:tcW w:type="dxa" w:w="1814"/>
             <w:tcBorders>
               <w:top w:val="single" w:sz="4" w:space="0" w:color="000000"/>
               <w:left w:val="single" w:sz="4" w:space="0" w:color="000000"/>
@@ -4126,7 +4263,7 @@
         </w:tc>
         <w:tc>
           <w:tcPr>
-            <w:tcW w:type="dxa" w:w="2268"/>
+            <w:tcW w:type="dxa" w:w="1814"/>
             <w:tcBorders>
               <w:top w:val="single" w:sz="4" w:space="0" w:color="000000"/>
               <w:left w:val="single" w:sz="4" w:space="0" w:color="000000"/>
@@ -4148,7 +4285,35 @@
                 <w:i w:val="0"/>
                 <w:sz w:val="20"/>
               </w:rPr>
-              <w:t>Simülasyon / ölçüm</w:t>
+              <w:t>SPICE</w:t>
+            </w:r>
+          </w:p>
+        </w:tc>
+        <w:tc>
+          <w:tcPr>
+            <w:tcW w:type="dxa" w:w="1814"/>
+            <w:tcBorders>
+              <w:top w:val="single" w:sz="4" w:space="0" w:color="000000"/>
+              <w:left w:val="single" w:sz="4" w:space="0" w:color="000000"/>
+              <w:bottom w:val="single" w:sz="4" w:space="0" w:color="000000"/>
+              <w:right w:val="single" w:sz="4" w:space="0" w:color="000000"/>
+            </w:tcBorders>
+            <w:shd w:val="clear" w:color="auto" w:fill="D9D9D9"/>
+          </w:tcPr>
+          <w:p>
+            <w:pPr>
+              <w:keepNext/>
+              <w:spacing w:line="240" w:lineRule="auto" w:after="20"/>
+              <w:jc w:val="center"/>
+            </w:pPr>
+            <w:r>
+              <w:rPr>
+                <w:rFonts w:ascii="Times New Roman" w:hAnsi="Times New Roman" w:cs="Times New Roman" w:eastAsia="Times New Roman"/>
+                <w:b/>
+                <w:i w:val="0"/>
+                <w:sz w:val="20"/>
+              </w:rPr>
+              <w:t>Ölçüm</w:t>
             </w:r>
           </w:p>
         </w:tc>
@@ -4159,7 +4324,7 @@
         </w:trPr>
         <w:tc>
           <w:tcPr>
-            <w:tcW w:type="dxa" w:w="3969"/>
+            <w:tcW w:type="dxa" w:w="3515"/>
             <w:tcBorders>
               <w:top w:val="single" w:sz="4" w:space="0" w:color="000000"/>
               <w:left w:val="single" w:sz="4" w:space="0" w:color="000000"/>
@@ -4200,7 +4365,7 @@
         </w:tc>
         <w:tc>
           <w:tcPr>
-            <w:tcW w:type="dxa" w:w="1984"/>
+            <w:tcW w:type="dxa" w:w="1814"/>
             <w:tcBorders>
               <w:top w:val="single" w:sz="4" w:space="0" w:color="000000"/>
               <w:left w:val="single" w:sz="4" w:space="0" w:color="000000"/>
@@ -4227,7 +4392,34 @@
         </w:tc>
         <w:tc>
           <w:tcPr>
-            <w:tcW w:type="dxa" w:w="2268"/>
+            <w:tcW w:type="dxa" w:w="1814"/>
+            <w:tcBorders>
+              <w:top w:val="single" w:sz="4" w:space="0" w:color="000000"/>
+              <w:left w:val="single" w:sz="4" w:space="0" w:color="000000"/>
+              <w:bottom w:val="single" w:sz="4" w:space="0" w:color="000000"/>
+              <w:right w:val="single" w:sz="4" w:space="0" w:color="000000"/>
+            </w:tcBorders>
+          </w:tcPr>
+          <w:p>
+            <w:pPr>
+              <w:keepNext/>
+              <w:spacing w:line="240" w:lineRule="auto" w:after="20"/>
+              <w:jc w:val="center"/>
+            </w:pPr>
+            <w:r>
+              <w:rPr>
+                <w:rFonts w:ascii="Times New Roman" w:hAnsi="Times New Roman" w:cs="Times New Roman" w:eastAsia="Times New Roman"/>
+                <w:b w:val="0"/>
+                <w:i w:val="0"/>
+                <w:sz w:val="20"/>
+              </w:rPr>
+              <w:t>3,52</w:t>
+            </w:r>
+          </w:p>
+        </w:tc>
+        <w:tc>
+          <w:tcPr>
+            <w:tcW w:type="dxa" w:w="1814"/>
             <w:tcBorders>
               <w:top w:val="single" w:sz="4" w:space="0" w:color="000000"/>
               <w:left w:val="single" w:sz="4" w:space="0" w:color="000000"/>
@@ -4259,7 +4451,134 @@
         </w:trPr>
         <w:tc>
           <w:tcPr>
-            <w:tcW w:type="dxa" w:w="3969"/>
+            <w:tcW w:type="dxa" w:w="3515"/>
+            <w:tcBorders>
+              <w:top w:val="single" w:sz="4" w:space="0" w:color="000000"/>
+              <w:left w:val="single" w:sz="4" w:space="0" w:color="000000"/>
+              <w:bottom w:val="single" w:sz="4" w:space="0" w:color="000000"/>
+              <w:right w:val="single" w:sz="4" w:space="0" w:color="000000"/>
+            </w:tcBorders>
+          </w:tcPr>
+          <w:p>
+            <w:pPr>
+              <w:keepNext/>
+              <w:spacing w:line="240" w:lineRule="auto" w:after="20"/>
+              <w:jc w:val="left"/>
+            </w:pPr>
+            <m:oMath>
+              <m:sSub>
+                <m:e>
+                  <m:r>
+                    <m:t>V</m:t>
+                  </m:r>
+                </m:e>
+                <m:sub>
+                  <m:r>
+                    <m:t>L</m:t>
+                  </m:r>
+                </m:sub>
+              </m:sSub>
+            </m:oMath>
+            <w:r>
+              <w:rPr>
+                <w:rFonts w:ascii="Times New Roman" w:hAnsi="Times New Roman" w:cs="Times New Roman" w:eastAsia="Times New Roman"/>
+                <w:b w:val="0"/>
+                <w:i w:val="0"/>
+                <w:sz w:val="20"/>
+              </w:rPr>
+              <w:t xml:space="preserve"> (V)</w:t>
+            </w:r>
+          </w:p>
+        </w:tc>
+        <w:tc>
+          <w:tcPr>
+            <w:tcW w:type="dxa" w:w="1814"/>
+            <w:tcBorders>
+              <w:top w:val="single" w:sz="4" w:space="0" w:color="000000"/>
+              <w:left w:val="single" w:sz="4" w:space="0" w:color="000000"/>
+              <w:bottom w:val="single" w:sz="4" w:space="0" w:color="000000"/>
+              <w:right w:val="single" w:sz="4" w:space="0" w:color="000000"/>
+            </w:tcBorders>
+          </w:tcPr>
+          <w:p>
+            <w:pPr>
+              <w:keepNext/>
+              <w:spacing w:line="240" w:lineRule="auto" w:after="20"/>
+              <w:jc w:val="center"/>
+            </w:pPr>
+            <w:r>
+              <w:rPr>
+                <w:rFonts w:ascii="Times New Roman" w:hAnsi="Times New Roman" w:cs="Times New Roman" w:eastAsia="Times New Roman"/>
+                <w:b w:val="0"/>
+                <w:i w:val="0"/>
+                <w:sz w:val="20"/>
+              </w:rPr>
+              <w:t>3,000</w:t>
+            </w:r>
+          </w:p>
+        </w:tc>
+        <w:tc>
+          <w:tcPr>
+            <w:tcW w:type="dxa" w:w="1814"/>
+            <w:tcBorders>
+              <w:top w:val="single" w:sz="4" w:space="0" w:color="000000"/>
+              <w:left w:val="single" w:sz="4" w:space="0" w:color="000000"/>
+              <w:bottom w:val="single" w:sz="4" w:space="0" w:color="000000"/>
+              <w:right w:val="single" w:sz="4" w:space="0" w:color="000000"/>
+            </w:tcBorders>
+          </w:tcPr>
+          <w:p>
+            <w:pPr>
+              <w:keepNext/>
+              <w:spacing w:line="240" w:lineRule="auto" w:after="20"/>
+              <w:jc w:val="center"/>
+            </w:pPr>
+            <w:r>
+              <w:rPr>
+                <w:rFonts w:ascii="Times New Roman" w:hAnsi="Times New Roman" w:cs="Times New Roman" w:eastAsia="Times New Roman"/>
+                <w:b w:val="0"/>
+                <w:i w:val="0"/>
+                <w:sz w:val="20"/>
+              </w:rPr>
+              <w:t>3,000</w:t>
+            </w:r>
+          </w:p>
+        </w:tc>
+        <w:tc>
+          <w:tcPr>
+            <w:tcW w:type="dxa" w:w="1814"/>
+            <w:tcBorders>
+              <w:top w:val="single" w:sz="4" w:space="0" w:color="000000"/>
+              <w:left w:val="single" w:sz="4" w:space="0" w:color="000000"/>
+              <w:bottom w:val="single" w:sz="4" w:space="0" w:color="000000"/>
+              <w:right w:val="single" w:sz="4" w:space="0" w:color="000000"/>
+            </w:tcBorders>
+          </w:tcPr>
+          <w:p>
+            <w:pPr>
+              <w:keepNext/>
+              <w:spacing w:line="240" w:lineRule="auto" w:after="20"/>
+              <w:jc w:val="center"/>
+            </w:pPr>
+            <w:r>
+              <w:rPr>
+                <w:rFonts w:ascii="Times New Roman" w:hAnsi="Times New Roman" w:cs="Times New Roman" w:eastAsia="Times New Roman"/>
+                <w:b w:val="0"/>
+                <w:i w:val="0"/>
+                <w:sz w:val="20"/>
+              </w:rPr>
+              <w:t>—</w:t>
+            </w:r>
+          </w:p>
+        </w:tc>
+      </w:tr>
+      <w:tr>
+        <w:trPr>
+          <w:cantSplit/>
+        </w:trPr>
+        <w:tc>
+          <w:tcPr>
+            <w:tcW w:type="dxa" w:w="3515"/>
             <w:tcBorders>
               <w:top w:val="single" w:sz="4" w:space="0" w:color="000000"/>
               <w:left w:val="single" w:sz="4" w:space="0" w:color="000000"/>
@@ -4300,7 +4619,7 @@
         </w:tc>
         <w:tc>
           <w:tcPr>
-            <w:tcW w:type="dxa" w:w="1984"/>
+            <w:tcW w:type="dxa" w:w="1814"/>
             <w:tcBorders>
               <w:top w:val="single" w:sz="4" w:space="0" w:color="000000"/>
               <w:left w:val="single" w:sz="4" w:space="0" w:color="000000"/>
@@ -4327,7 +4646,34 @@
         </w:tc>
         <w:tc>
           <w:tcPr>
-            <w:tcW w:type="dxa" w:w="2268"/>
+            <w:tcW w:type="dxa" w:w="1814"/>
+            <w:tcBorders>
+              <w:top w:val="single" w:sz="4" w:space="0" w:color="000000"/>
+              <w:left w:val="single" w:sz="4" w:space="0" w:color="000000"/>
+              <w:bottom w:val="single" w:sz="4" w:space="0" w:color="000000"/>
+              <w:right w:val="single" w:sz="4" w:space="0" w:color="000000"/>
+            </w:tcBorders>
+          </w:tcPr>
+          <w:p>
+            <w:pPr>
+              <w:keepNext/>
+              <w:spacing w:line="240" w:lineRule="auto" w:after="20"/>
+              <w:jc w:val="center"/>
+            </w:pPr>
+            <w:r>
+              <w:rPr>
+                <w:rFonts w:ascii="Times New Roman" w:hAnsi="Times New Roman" w:cs="Times New Roman" w:eastAsia="Times New Roman"/>
+                <w:b w:val="0"/>
+                <w:i w:val="0"/>
+                <w:sz w:val="20"/>
+              </w:rPr>
+              <w:t>0,852</w:t>
+            </w:r>
+          </w:p>
+        </w:tc>
+        <w:tc>
+          <w:tcPr>
+            <w:tcW w:type="dxa" w:w="1814"/>
             <w:tcBorders>
               <w:top w:val="single" w:sz="4" w:space="0" w:color="000000"/>
               <w:left w:val="single" w:sz="4" w:space="0" w:color="000000"/>
@@ -4359,7 +4705,7 @@
         </w:trPr>
         <w:tc>
           <w:tcPr>
-            <w:tcW w:type="dxa" w:w="3969"/>
+            <w:tcW w:type="dxa" w:w="3515"/>
             <w:tcBorders>
               <w:top w:val="single" w:sz="4" w:space="0" w:color="000000"/>
               <w:left w:val="single" w:sz="4" w:space="0" w:color="000000"/>
@@ -4400,7 +4746,7 @@
         </w:tc>
         <w:tc>
           <w:tcPr>
-            <w:tcW w:type="dxa" w:w="1984"/>
+            <w:tcW w:type="dxa" w:w="1814"/>
             <w:tcBorders>
               <w:top w:val="single" w:sz="4" w:space="0" w:color="000000"/>
               <w:left w:val="single" w:sz="4" w:space="0" w:color="000000"/>
@@ -4427,7 +4773,34 @@
         </w:tc>
         <w:tc>
           <w:tcPr>
-            <w:tcW w:type="dxa" w:w="2268"/>
+            <w:tcW w:type="dxa" w:w="1814"/>
+            <w:tcBorders>
+              <w:top w:val="single" w:sz="4" w:space="0" w:color="000000"/>
+              <w:left w:val="single" w:sz="4" w:space="0" w:color="000000"/>
+              <w:bottom w:val="single" w:sz="4" w:space="0" w:color="000000"/>
+              <w:right w:val="single" w:sz="4" w:space="0" w:color="000000"/>
+            </w:tcBorders>
+          </w:tcPr>
+          <w:p>
+            <w:pPr>
+              <w:keepNext w:val="0"/>
+              <w:spacing w:line="240" w:lineRule="auto" w:after="20"/>
+              <w:jc w:val="center"/>
+            </w:pPr>
+            <w:r>
+              <w:rPr>
+                <w:rFonts w:ascii="Times New Roman" w:hAnsi="Times New Roman" w:cs="Times New Roman" w:eastAsia="Times New Roman"/>
+                <w:b w:val="0"/>
+                <w:i w:val="0"/>
+                <w:sz w:val="20"/>
+              </w:rPr>
+              <w:t>2,557</w:t>
+            </w:r>
+          </w:p>
+        </w:tc>
+        <w:tc>
+          <w:tcPr>
+            <w:tcW w:type="dxa" w:w="1814"/>
             <w:tcBorders>
               <w:top w:val="single" w:sz="4" w:space="0" w:color="000000"/>
               <w:left w:val="single" w:sz="4" w:space="0" w:color="000000"/>
@@ -6974,7 +7347,7 @@
           <w:i w:val="0"/>
           <w:sz w:val="20"/>
         </w:rPr>
-        <w:t>Tablo 4.3.1  Süperpozisyon devresi için teorik değerler (Şekil 3)</w:t>
+        <w:t>Tablo 4.3.1  Süperpozisyon devresi için teorik ve SPICE değerleri (Şekil 3)</w:t>
       </w:r>
     </w:p>
     <w:tbl>
@@ -6985,9 +7358,10 @@
         <w:tblLook w:firstColumn="1" w:firstRow="1" w:lastColumn="0" w:lastRow="0" w:noHBand="0" w:noVBand="1" w:val="04A0"/>
       </w:tblPr>
       <w:tblGrid>
-        <w:gridCol w:w="3969"/>
-        <w:gridCol w:w="1984"/>
-        <w:gridCol w:w="2268"/>
+        <w:gridCol w:w="3515"/>
+        <w:gridCol w:w="1814"/>
+        <w:gridCol w:w="1814"/>
+        <w:gridCol w:w="1814"/>
       </w:tblGrid>
       <w:tr>
         <w:trPr>
@@ -6996,7 +7370,7 @@
         </w:trPr>
         <w:tc>
           <w:tcPr>
-            <w:tcW w:type="dxa" w:w="3969"/>
+            <w:tcW w:type="dxa" w:w="3515"/>
             <w:tcBorders>
               <w:top w:val="single" w:sz="4" w:space="0" w:color="000000"/>
               <w:left w:val="single" w:sz="4" w:space="0" w:color="000000"/>
@@ -7024,7 +7398,7 @@
         </w:tc>
         <w:tc>
           <w:tcPr>
-            <w:tcW w:type="dxa" w:w="1984"/>
+            <w:tcW w:type="dxa" w:w="1814"/>
             <w:tcBorders>
               <w:top w:val="single" w:sz="4" w:space="0" w:color="000000"/>
               <w:left w:val="single" w:sz="4" w:space="0" w:color="000000"/>
@@ -7052,7 +7426,7 @@
         </w:tc>
         <w:tc>
           <w:tcPr>
-            <w:tcW w:type="dxa" w:w="2268"/>
+            <w:tcW w:type="dxa" w:w="1814"/>
             <w:tcBorders>
               <w:top w:val="single" w:sz="4" w:space="0" w:color="000000"/>
               <w:left w:val="single" w:sz="4" w:space="0" w:color="000000"/>
@@ -7074,7 +7448,35 @@
                 <w:i w:val="0"/>
                 <w:sz w:val="20"/>
               </w:rPr>
-              <w:t>Simülasyon / ölçüm</w:t>
+              <w:t>SPICE</w:t>
+            </w:r>
+          </w:p>
+        </w:tc>
+        <w:tc>
+          <w:tcPr>
+            <w:tcW w:type="dxa" w:w="1814"/>
+            <w:tcBorders>
+              <w:top w:val="single" w:sz="4" w:space="0" w:color="000000"/>
+              <w:left w:val="single" w:sz="4" w:space="0" w:color="000000"/>
+              <w:bottom w:val="single" w:sz="4" w:space="0" w:color="000000"/>
+              <w:right w:val="single" w:sz="4" w:space="0" w:color="000000"/>
+            </w:tcBorders>
+            <w:shd w:val="clear" w:color="auto" w:fill="D9D9D9"/>
+          </w:tcPr>
+          <w:p>
+            <w:pPr>
+              <w:keepNext/>
+              <w:spacing w:line="240" w:lineRule="auto" w:after="20"/>
+              <w:jc w:val="center"/>
+            </w:pPr>
+            <w:r>
+              <w:rPr>
+                <w:rFonts w:ascii="Times New Roman" w:hAnsi="Times New Roman" w:cs="Times New Roman" w:eastAsia="Times New Roman"/>
+                <w:b/>
+                <w:i w:val="0"/>
+                <w:sz w:val="20"/>
+              </w:rPr>
+              <w:t>Ölçüm</w:t>
             </w:r>
           </w:p>
         </w:tc>
@@ -7085,7 +7487,7 @@
         </w:trPr>
         <w:tc>
           <w:tcPr>
-            <w:tcW w:type="dxa" w:w="3969"/>
+            <w:tcW w:type="dxa" w:w="3515"/>
             <w:tcBorders>
               <w:top w:val="single" w:sz="4" w:space="0" w:color="000000"/>
               <w:left w:val="single" w:sz="4" w:space="0" w:color="000000"/>
@@ -7129,7 +7531,7 @@
         </w:tc>
         <w:tc>
           <w:tcPr>
-            <w:tcW w:type="dxa" w:w="1984"/>
+            <w:tcW w:type="dxa" w:w="1814"/>
             <w:tcBorders>
               <w:top w:val="single" w:sz="4" w:space="0" w:color="000000"/>
               <w:left w:val="single" w:sz="4" w:space="0" w:color="000000"/>
@@ -7156,7 +7558,34 @@
         </w:tc>
         <w:tc>
           <w:tcPr>
-            <w:tcW w:type="dxa" w:w="2268"/>
+            <w:tcW w:type="dxa" w:w="1814"/>
+            <w:tcBorders>
+              <w:top w:val="single" w:sz="4" w:space="0" w:color="000000"/>
+              <w:left w:val="single" w:sz="4" w:space="0" w:color="000000"/>
+              <w:bottom w:val="single" w:sz="4" w:space="0" w:color="000000"/>
+              <w:right w:val="single" w:sz="4" w:space="0" w:color="000000"/>
+            </w:tcBorders>
+          </w:tcPr>
+          <w:p>
+            <w:pPr>
+              <w:keepNext/>
+              <w:spacing w:line="240" w:lineRule="auto" w:after="20"/>
+              <w:jc w:val="center"/>
+            </w:pPr>
+            <w:r>
+              <w:rPr>
+                <w:rFonts w:ascii="Times New Roman" w:hAnsi="Times New Roman" w:cs="Times New Roman" w:eastAsia="Times New Roman"/>
+                <w:b w:val="0"/>
+                <w:i w:val="0"/>
+                <w:sz w:val="20"/>
+              </w:rPr>
+              <w:t>4,796</w:t>
+            </w:r>
+          </w:p>
+        </w:tc>
+        <w:tc>
+          <w:tcPr>
+            <w:tcW w:type="dxa" w:w="1814"/>
             <w:tcBorders>
               <w:top w:val="single" w:sz="4" w:space="0" w:color="000000"/>
               <w:left w:val="single" w:sz="4" w:space="0" w:color="000000"/>
@@ -7188,7 +7617,7 @@
         </w:trPr>
         <w:tc>
           <w:tcPr>
-            <w:tcW w:type="dxa" w:w="3969"/>
+            <w:tcW w:type="dxa" w:w="3515"/>
             <w:tcBorders>
               <w:top w:val="single" w:sz="4" w:space="0" w:color="000000"/>
               <w:left w:val="single" w:sz="4" w:space="0" w:color="000000"/>
@@ -7258,7 +7687,7 @@
         </w:tc>
         <w:tc>
           <w:tcPr>
-            <w:tcW w:type="dxa" w:w="1984"/>
+            <w:tcW w:type="dxa" w:w="1814"/>
             <w:tcBorders>
               <w:top w:val="single" w:sz="4" w:space="0" w:color="000000"/>
               <w:left w:val="single" w:sz="4" w:space="0" w:color="000000"/>
@@ -7285,7 +7714,34 @@
         </w:tc>
         <w:tc>
           <w:tcPr>
-            <w:tcW w:type="dxa" w:w="2268"/>
+            <w:tcW w:type="dxa" w:w="1814"/>
+            <w:tcBorders>
+              <w:top w:val="single" w:sz="4" w:space="0" w:color="000000"/>
+              <w:left w:val="single" w:sz="4" w:space="0" w:color="000000"/>
+              <w:bottom w:val="single" w:sz="4" w:space="0" w:color="000000"/>
+              <w:right w:val="single" w:sz="4" w:space="0" w:color="000000"/>
+            </w:tcBorders>
+          </w:tcPr>
+          <w:p>
+            <w:pPr>
+              <w:keepNext/>
+              <w:spacing w:line="240" w:lineRule="auto" w:after="20"/>
+              <w:jc w:val="center"/>
+            </w:pPr>
+            <w:r>
+              <w:rPr>
+                <w:rFonts w:ascii="Times New Roman" w:hAnsi="Times New Roman" w:cs="Times New Roman" w:eastAsia="Times New Roman"/>
+                <w:b w:val="0"/>
+                <w:i w:val="0"/>
+                <w:sz w:val="20"/>
+              </w:rPr>
+              <w:t>4,256</w:t>
+            </w:r>
+          </w:p>
+        </w:tc>
+        <w:tc>
+          <w:tcPr>
+            <w:tcW w:type="dxa" w:w="1814"/>
             <w:tcBorders>
               <w:top w:val="single" w:sz="4" w:space="0" w:color="000000"/>
               <w:left w:val="single" w:sz="4" w:space="0" w:color="000000"/>
@@ -7317,7 +7773,7 @@
         </w:trPr>
         <w:tc>
           <w:tcPr>
-            <w:tcW w:type="dxa" w:w="3969"/>
+            <w:tcW w:type="dxa" w:w="3515"/>
             <w:tcBorders>
               <w:top w:val="single" w:sz="4" w:space="0" w:color="000000"/>
               <w:left w:val="single" w:sz="4" w:space="0" w:color="000000"/>
@@ -7387,7 +7843,7 @@
         </w:tc>
         <w:tc>
           <w:tcPr>
-            <w:tcW w:type="dxa" w:w="1984"/>
+            <w:tcW w:type="dxa" w:w="1814"/>
             <w:tcBorders>
               <w:top w:val="single" w:sz="4" w:space="0" w:color="000000"/>
               <w:left w:val="single" w:sz="4" w:space="0" w:color="000000"/>
@@ -7414,7 +7870,34 @@
         </w:tc>
         <w:tc>
           <w:tcPr>
-            <w:tcW w:type="dxa" w:w="2268"/>
+            <w:tcW w:type="dxa" w:w="1814"/>
+            <w:tcBorders>
+              <w:top w:val="single" w:sz="4" w:space="0" w:color="000000"/>
+              <w:left w:val="single" w:sz="4" w:space="0" w:color="000000"/>
+              <w:bottom w:val="single" w:sz="4" w:space="0" w:color="000000"/>
+              <w:right w:val="single" w:sz="4" w:space="0" w:color="000000"/>
+            </w:tcBorders>
+          </w:tcPr>
+          <w:p>
+            <w:pPr>
+              <w:keepNext/>
+              <w:spacing w:line="240" w:lineRule="auto" w:after="20"/>
+              <w:jc w:val="center"/>
+            </w:pPr>
+            <w:r>
+              <w:rPr>
+                <w:rFonts w:ascii="Times New Roman" w:hAnsi="Times New Roman" w:cs="Times New Roman" w:eastAsia="Times New Roman"/>
+                <w:b w:val="0"/>
+                <w:i w:val="0"/>
+                <w:sz w:val="20"/>
+              </w:rPr>
+              <w:t>0,540</w:t>
+            </w:r>
+          </w:p>
+        </w:tc>
+        <w:tc>
+          <w:tcPr>
+            <w:tcW w:type="dxa" w:w="1814"/>
             <w:tcBorders>
               <w:top w:val="single" w:sz="4" w:space="0" w:color="000000"/>
               <w:left w:val="single" w:sz="4" w:space="0" w:color="000000"/>
@@ -7446,7 +7929,7 @@
         </w:trPr>
         <w:tc>
           <w:tcPr>
-            <w:tcW w:type="dxa" w:w="3969"/>
+            <w:tcW w:type="dxa" w:w="3515"/>
             <w:tcBorders>
               <w:top w:val="single" w:sz="4" w:space="0" w:color="000000"/>
               <w:left w:val="single" w:sz="4" w:space="0" w:color="000000"/>
@@ -7490,7 +7973,7 @@
         </w:tc>
         <w:tc>
           <w:tcPr>
-            <w:tcW w:type="dxa" w:w="1984"/>
+            <w:tcW w:type="dxa" w:w="1814"/>
             <w:tcBorders>
               <w:top w:val="single" w:sz="4" w:space="0" w:color="000000"/>
               <w:left w:val="single" w:sz="4" w:space="0" w:color="000000"/>
@@ -7517,7 +8000,34 @@
         </w:tc>
         <w:tc>
           <w:tcPr>
-            <w:tcW w:type="dxa" w:w="2268"/>
+            <w:tcW w:type="dxa" w:w="1814"/>
+            <w:tcBorders>
+              <w:top w:val="single" w:sz="4" w:space="0" w:color="000000"/>
+              <w:left w:val="single" w:sz="4" w:space="0" w:color="000000"/>
+              <w:bottom w:val="single" w:sz="4" w:space="0" w:color="000000"/>
+              <w:right w:val="single" w:sz="4" w:space="0" w:color="000000"/>
+            </w:tcBorders>
+          </w:tcPr>
+          <w:p>
+            <w:pPr>
+              <w:keepNext/>
+              <w:spacing w:line="240" w:lineRule="auto" w:after="20"/>
+              <w:jc w:val="center"/>
+            </w:pPr>
+            <w:r>
+              <w:rPr>
+                <w:rFonts w:ascii="Times New Roman" w:hAnsi="Times New Roman" w:cs="Times New Roman" w:eastAsia="Times New Roman"/>
+                <w:b w:val="0"/>
+                <w:i w:val="0"/>
+                <w:sz w:val="20"/>
+              </w:rPr>
+              <w:t>0,851</w:t>
+            </w:r>
+          </w:p>
+        </w:tc>
+        <w:tc>
+          <w:tcPr>
+            <w:tcW w:type="dxa" w:w="1814"/>
             <w:tcBorders>
               <w:top w:val="single" w:sz="4" w:space="0" w:color="000000"/>
               <w:left w:val="single" w:sz="4" w:space="0" w:color="000000"/>
@@ -7549,7 +8059,7 @@
         </w:trPr>
         <w:tc>
           <w:tcPr>
-            <w:tcW w:type="dxa" w:w="3969"/>
+            <w:tcW w:type="dxa" w:w="3515"/>
             <w:tcBorders>
               <w:top w:val="single" w:sz="4" w:space="0" w:color="000000"/>
               <w:left w:val="single" w:sz="4" w:space="0" w:color="000000"/>
@@ -7632,7 +8142,7 @@
         </w:tc>
         <w:tc>
           <w:tcPr>
-            <w:tcW w:type="dxa" w:w="1984"/>
+            <w:tcW w:type="dxa" w:w="1814"/>
             <w:tcBorders>
               <w:top w:val="single" w:sz="4" w:space="0" w:color="000000"/>
               <w:left w:val="single" w:sz="4" w:space="0" w:color="000000"/>
@@ -7659,7 +8169,34 @@
         </w:tc>
         <w:tc>
           <w:tcPr>
-            <w:tcW w:type="dxa" w:w="2268"/>
+            <w:tcW w:type="dxa" w:w="1814"/>
+            <w:tcBorders>
+              <w:top w:val="single" w:sz="4" w:space="0" w:color="000000"/>
+              <w:left w:val="single" w:sz="4" w:space="0" w:color="000000"/>
+              <w:bottom w:val="single" w:sz="4" w:space="0" w:color="000000"/>
+              <w:right w:val="single" w:sz="4" w:space="0" w:color="000000"/>
+            </w:tcBorders>
+          </w:tcPr>
+          <w:p>
+            <w:pPr>
+              <w:keepNext w:val="0"/>
+              <w:spacing w:line="240" w:lineRule="auto" w:after="20"/>
+              <w:jc w:val="center"/>
+            </w:pPr>
+            <w:r>
+              <w:rPr>
+                <w:rFonts w:ascii="Times New Roman" w:hAnsi="Times New Roman" w:cs="Times New Roman" w:eastAsia="Times New Roman"/>
+                <w:b w:val="0"/>
+                <w:i w:val="0"/>
+                <w:sz w:val="20"/>
+              </w:rPr>
+              <w:t>5,635</w:t>
+            </w:r>
+          </w:p>
+        </w:tc>
+        <w:tc>
+          <w:tcPr>
+            <w:tcW w:type="dxa" w:w="1814"/>
             <w:tcBorders>
               <w:top w:val="single" w:sz="4" w:space="0" w:color="000000"/>
               <w:left w:val="single" w:sz="4" w:space="0" w:color="000000"/>
@@ -7805,7 +8342,7 @@
           <w:b w:val="0"/>
           <w:i w:val="0"/>
         </w:rPr>
-        <w:t xml:space="preserve"> olarak hesaplanmıştır. Kaynakları sıfırlayarak bulunan direnç aynı değeri vermiştir. Simülasyon ve ölçüm sonuçları henüz tablolara işlenmediği için teorik değerle karşılaştırılmış bir yüzde fark verilememiştir.</w:t>
+        <w:t xml:space="preserve"> olarak hesaplanmıştır. Kaynakları sıfırlayarak bulunan direnç aynı değeri vermiştir. SPICE sonuçları teorik değerlerle yuvarlama düzeyinde uyuşmaktadır.</w:t>
       </w:r>
     </w:p>
     <w:p>
@@ -7986,7 +8523,7 @@
           <w:b w:val="0"/>
           <w:i w:val="0"/>
         </w:rPr>
-        <w:t xml:space="preserve"> Bu raporda simülasyon ve ölçüm sütunları boş bırakılmıştır. Teorik değerler ile ölçülen değerlerin karşılaştırılması, hata paylarının yorumlanması ve ölçüm kaynaklı sapmaların nedenleri bu sütunlar doldurulduktan sonra yazılmalıdır.</w:t>
+        <w:t xml:space="preserve"> Bu deneyde laboratuvar ölçümü yapılmadığı için ölçüm sütunları boştur. Teorik değerler SPICE sonuçlarıyla doğrulanmıştır; ölçülen değerlerle karşılaştırma ve hata payı yorumu, ölçümler yapıldıktan sonra eklenmelidir.</w:t>
       </w:r>
     </w:p>
     <w:p>

</xml_diff>

<commit_message>
Deney 2 raporu: ngspice çıktı görüntüsü (simülasyon olarak etiketli)
</commit_message>
<xml_diff>
--- a/ele201l_deney2_lab/build/ELE201L_Deney2_Laboratuvar_Raporu.docx
+++ b/ele201l_deney2_lab/build/ELE201L_Deney2_Laboratuvar_Raporu.docx
@@ -2906,6 +2906,62 @@
     </w:p>
     <w:p>
       <w:pPr>
+        <w:keepNext/>
+        <w:spacing w:line="240" w:lineRule="auto"/>
+        <w:jc w:val="center"/>
+      </w:pPr>
+      <w:r>
+        <w:drawing>
+          <wp:inline xmlns:a="http://schemas.openxmlformats.org/drawingml/2006/main" xmlns:pic="http://schemas.openxmlformats.org/drawingml/2006/picture">
+            <wp:extent cx="4680000" cy="1653600"/>
+            <wp:docPr id="3" name="Picture 3"/>
+            <wp:cNvGraphicFramePr>
+              <a:graphicFrameLocks noChangeAspect="1"/>
+            </wp:cNvGraphicFramePr>
+            <a:graphic>
+              <a:graphicData uri="http://schemas.openxmlformats.org/drawingml/2006/picture">
+                <pic:pic>
+                  <pic:nvPicPr>
+                    <pic:cNvPr id="0" name="spice_cikti.png"/>
+                    <pic:cNvPicPr/>
+                  </pic:nvPicPr>
+                  <pic:blipFill>
+                    <a:blip r:embed="rId12"/>
+                    <a:stretch>
+                      <a:fillRect/>
+                    </a:stretch>
+                  </pic:blipFill>
+                  <pic:spPr>
+                    <a:xfrm>
+                      <a:off x="0" y="0"/>
+                      <a:ext cx="4680000" cy="1653600"/>
+                    </a:xfrm>
+                    <a:prstGeom prst="rect"/>
+                  </pic:spPr>
+                </pic:pic>
+              </a:graphicData>
+            </a:graphic>
+          </wp:inline>
+        </w:drawing>
+      </w:r>
+    </w:p>
+    <w:p>
+      <w:pPr>
+        <w:spacing w:line="240" w:lineRule="auto" w:after="240"/>
+        <w:jc w:val="center"/>
+      </w:pPr>
+      <w:r>
+        <w:rPr>
+          <w:rFonts w:ascii="Times New Roman" w:hAnsi="Times New Roman" w:cs="Times New Roman" w:eastAsia="Times New Roman"/>
+          <w:b w:val="0"/>
+          <w:i w:val="0"/>
+          <w:sz w:val="20"/>
+        </w:rPr>
+        <w:t>Şekil 4.1.2  Şekil 1 devresinin ngspice (batch modu) ile çalıştırılmış analiz çıktısı. Bu bir simülasyon çıktısıdır, laboratuvar ölçümü değildir.</w:t>
+      </w:r>
+    </w:p>
+    <w:p>
+      <w:pPr>
         <w:jc w:val="both"/>
       </w:pPr>
       <w:r>
@@ -3085,7 +3141,7 @@
         <w:drawing>
           <wp:inline xmlns:a="http://schemas.openxmlformats.org/drawingml/2006/main" xmlns:pic="http://schemas.openxmlformats.org/drawingml/2006/picture">
             <wp:extent cx="2880000" cy="1508571"/>
-            <wp:docPr id="3" name="Picture 3"/>
+            <wp:docPr id="4" name="Picture 4"/>
             <wp:cNvGraphicFramePr>
               <a:graphicFrameLocks noChangeAspect="1"/>
             </wp:cNvGraphicFramePr>
@@ -3097,7 +3153,7 @@
                     <pic:cNvPicPr/>
                   </pic:nvPicPr>
                   <pic:blipFill>
-                    <a:blip r:embed="rId12"/>
+                    <a:blip r:embed="rId13"/>
                     <a:stretch>
                       <a:fillRect/>
                     </a:stretch>
@@ -5176,7 +5232,7 @@
         <w:drawing>
           <wp:inline xmlns:a="http://schemas.openxmlformats.org/drawingml/2006/main" xmlns:pic="http://schemas.openxmlformats.org/drawingml/2006/picture">
             <wp:extent cx="3240000" cy="2068085"/>
-            <wp:docPr id="4" name="Picture 4"/>
+            <wp:docPr id="5" name="Picture 5"/>
             <wp:cNvGraphicFramePr>
               <a:graphicFrameLocks noChangeAspect="1"/>
             </wp:cNvGraphicFramePr>
@@ -5188,7 +5244,7 @@
                     <pic:cNvPicPr/>
                   </pic:nvPicPr>
                   <pic:blipFill>
-                    <a:blip r:embed="rId13"/>
+                    <a:blip r:embed="rId14"/>
                     <a:stretch>
                       <a:fillRect/>
                     </a:stretch>

</xml_diff>

<commit_message>
Deney 2 raporu: devre tahtası yerleşimleri eklendi
</commit_message>
<xml_diff>
--- a/ele201l_deney2_lab/build/ELE201L_Deney2_Laboratuvar_Raporu.docx
+++ b/ele201l_deney2_lab/build/ELE201L_Deney2_Laboratuvar_Raporu.docx
@@ -732,6 +732,62 @@
           <w:sz w:val="20"/>
         </w:rPr>
         <w:t xml:space="preserve"> uçlarından ölçülür.</w:t>
+      </w:r>
+    </w:p>
+    <w:p>
+      <w:pPr>
+        <w:keepNext/>
+        <w:spacing w:line="240" w:lineRule="auto"/>
+        <w:jc w:val="center"/>
+      </w:pPr>
+      <w:r>
+        <w:drawing>
+          <wp:inline xmlns:a="http://schemas.openxmlformats.org/drawingml/2006/main" xmlns:pic="http://schemas.openxmlformats.org/drawingml/2006/picture">
+            <wp:extent cx="5040000" cy="2100000"/>
+            <wp:docPr id="3" name="Picture 3"/>
+            <wp:cNvGraphicFramePr>
+              <a:graphicFrameLocks noChangeAspect="1"/>
+            </wp:cNvGraphicFramePr>
+            <a:graphic>
+              <a:graphicData uri="http://schemas.openxmlformats.org/drawingml/2006/picture">
+                <pic:pic>
+                  <pic:nvPicPr>
+                    <pic:cNvPr id="0" name="bb2_s1.png"/>
+                    <pic:cNvPicPr/>
+                  </pic:nvPicPr>
+                  <pic:blipFill>
+                    <a:blip r:embed="rId12"/>
+                    <a:stretch>
+                      <a:fillRect/>
+                    </a:stretch>
+                  </pic:blipFill>
+                  <pic:spPr>
+                    <a:xfrm>
+                      <a:off x="0" y="0"/>
+                      <a:ext cx="5040000" cy="2100000"/>
+                    </a:xfrm>
+                    <a:prstGeom prst="rect"/>
+                  </pic:spPr>
+                </pic:pic>
+              </a:graphicData>
+            </a:graphic>
+          </wp:inline>
+        </w:drawing>
+      </w:r>
+    </w:p>
+    <w:p>
+      <w:pPr>
+        <w:spacing w:line="240" w:lineRule="auto" w:after="240"/>
+        <w:jc w:val="center"/>
+      </w:pPr>
+      <w:r>
+        <w:rPr>
+          <w:rFonts w:ascii="Times New Roman" w:hAnsi="Times New Roman" w:cs="Times New Roman" w:eastAsia="Times New Roman"/>
+          <w:b w:val="0"/>
+          <w:i w:val="0"/>
+          <w:sz w:val="20"/>
+        </w:rPr>
+        <w:t>Şekil 4.1.2  Şekil 1 devresinin devre tahtası yerleşimi. Kaynak artı ucu üst rayda, eksi ucu alt rayda bulunur.</w:t>
       </w:r>
     </w:p>
     <w:p>
@@ -2914,7 +2970,7 @@
         <w:drawing>
           <wp:inline xmlns:a="http://schemas.openxmlformats.org/drawingml/2006/main" xmlns:pic="http://schemas.openxmlformats.org/drawingml/2006/picture">
             <wp:extent cx="4680000" cy="1653600"/>
-            <wp:docPr id="3" name="Picture 3"/>
+            <wp:docPr id="4" name="Picture 4"/>
             <wp:cNvGraphicFramePr>
               <a:graphicFrameLocks noChangeAspect="1"/>
             </wp:cNvGraphicFramePr>
@@ -2926,7 +2982,7 @@
                     <pic:cNvPicPr/>
                   </pic:nvPicPr>
                   <pic:blipFill>
-                    <a:blip r:embed="rId12"/>
+                    <a:blip r:embed="rId13"/>
                     <a:stretch>
                       <a:fillRect/>
                     </a:stretch>
@@ -2957,7 +3013,7 @@
           <w:i w:val="0"/>
           <w:sz w:val="20"/>
         </w:rPr>
-        <w:t>Şekil 4.1.2  Şekil 1 devresinin ngspice (batch modu) ile çalıştırılmış analiz çıktısı. Bu bir simülasyon çıktısıdır, laboratuvar ölçümü değildir.</w:t>
+        <w:t>Şekil 4.1.3  Şekil 1 devresinin ngspice (batch modu) ile çalıştırılmış analiz çıktısı. Bu bir simülasyon çıktısıdır, laboratuvar ölçümü değildir.</w:t>
       </w:r>
     </w:p>
     <w:p>
@@ -3141,7 +3197,7 @@
         <w:drawing>
           <wp:inline xmlns:a="http://schemas.openxmlformats.org/drawingml/2006/main" xmlns:pic="http://schemas.openxmlformats.org/drawingml/2006/picture">
             <wp:extent cx="2880000" cy="1508571"/>
-            <wp:docPr id="4" name="Picture 4"/>
+            <wp:docPr id="5" name="Picture 5"/>
             <wp:cNvGraphicFramePr>
               <a:graphicFrameLocks noChangeAspect="1"/>
             </wp:cNvGraphicFramePr>
@@ -3153,7 +3209,7 @@
                     <pic:cNvPicPr/>
                   </pic:nvPicPr>
                   <pic:blipFill>
-                    <a:blip r:embed="rId13"/>
+                    <a:blip r:embed="rId14"/>
                     <a:stretch>
                       <a:fillRect/>
                     </a:stretch>
@@ -3231,6 +3287,85 @@
           <w:sz w:val="20"/>
         </w:rPr>
         <w:t xml:space="preserve"> ayrıca belirtilmiştir.</w:t>
+      </w:r>
+    </w:p>
+    <w:p>
+      <w:pPr>
+        <w:keepNext/>
+        <w:spacing w:line="240" w:lineRule="auto"/>
+        <w:jc w:val="center"/>
+      </w:pPr>
+      <w:r>
+        <w:drawing>
+          <wp:inline xmlns:a="http://schemas.openxmlformats.org/drawingml/2006/main" xmlns:pic="http://schemas.openxmlformats.org/drawingml/2006/picture">
+            <wp:extent cx="5040000" cy="2100000"/>
+            <wp:docPr id="6" name="Picture 6"/>
+            <wp:cNvGraphicFramePr>
+              <a:graphicFrameLocks noChangeAspect="1"/>
+            </wp:cNvGraphicFramePr>
+            <a:graphic>
+              <a:graphicData uri="http://schemas.openxmlformats.org/drawingml/2006/picture">
+                <pic:pic>
+                  <pic:nvPicPr>
+                    <pic:cNvPr id="0" name="bb2_s2.png"/>
+                    <pic:cNvPicPr/>
+                  </pic:nvPicPr>
+                  <pic:blipFill>
+                    <a:blip r:embed="rId15"/>
+                    <a:stretch>
+                      <a:fillRect/>
+                    </a:stretch>
+                  </pic:blipFill>
+                  <pic:spPr>
+                    <a:xfrm>
+                      <a:off x="0" y="0"/>
+                      <a:ext cx="5040000" cy="2100000"/>
+                    </a:xfrm>
+                    <a:prstGeom prst="rect"/>
+                  </pic:spPr>
+                </pic:pic>
+              </a:graphicData>
+            </a:graphic>
+          </wp:inline>
+        </w:drawing>
+      </w:r>
+    </w:p>
+    <w:p>
+      <w:pPr>
+        <w:spacing w:line="240" w:lineRule="auto" w:after="240"/>
+        <w:jc w:val="center"/>
+      </w:pPr>
+      <w:r>
+        <w:rPr>
+          <w:rFonts w:ascii="Times New Roman" w:hAnsi="Times New Roman" w:cs="Times New Roman" w:eastAsia="Times New Roman"/>
+          <w:b w:val="0"/>
+          <w:i w:val="0"/>
+          <w:sz w:val="20"/>
+        </w:rPr>
+        <w:t xml:space="preserve">Şekil 4.2.2  Şekil 2 devresinin devre tahtası yerleşimi. Yük direnci </w:t>
+      </w:r>
+      <m:oMath>
+        <m:sSub>
+          <m:e>
+            <m:r>
+              <m:t>R</m:t>
+            </m:r>
+          </m:e>
+          <m:sub>
+            <m:r>
+              <m:t>L</m:t>
+            </m:r>
+          </m:sub>
+        </m:sSub>
+      </m:oMath>
+      <w:r>
+        <w:rPr>
+          <w:rFonts w:ascii="Times New Roman" w:hAnsi="Times New Roman" w:cs="Times New Roman" w:eastAsia="Times New Roman"/>
+          <w:b w:val="0"/>
+          <w:i w:val="0"/>
+          <w:sz w:val="20"/>
+        </w:rPr>
+        <w:t>, çıkış düğümü ile alt ray arasına bağlanmıştır.</w:t>
       </w:r>
     </w:p>
     <w:p>
@@ -5232,7 +5367,7 @@
         <w:drawing>
           <wp:inline xmlns:a="http://schemas.openxmlformats.org/drawingml/2006/main" xmlns:pic="http://schemas.openxmlformats.org/drawingml/2006/picture">
             <wp:extent cx="3240000" cy="2068085"/>
-            <wp:docPr id="5" name="Picture 5"/>
+            <wp:docPr id="7" name="Picture 7"/>
             <wp:cNvGraphicFramePr>
               <a:graphicFrameLocks noChangeAspect="1"/>
             </wp:cNvGraphicFramePr>
@@ -5244,7 +5379,7 @@
                     <pic:cNvPicPr/>
                   </pic:nvPicPr>
                   <pic:blipFill>
-                    <a:blip r:embed="rId14"/>
+                    <a:blip r:embed="rId16"/>
                     <a:stretch>
                       <a:fillRect/>
                     </a:stretch>
@@ -5276,6 +5411,62 @@
           <w:sz w:val="20"/>
         </w:rPr>
         <w:t>Şekil 4.3.1  İki bağımsız kaynak içeren devre (föy Şekil 3 [1]). Terminal C–D’den görülen Thevenin eşdeğeri hesaplanmıştır.</w:t>
+      </w:r>
+    </w:p>
+    <w:p>
+      <w:pPr>
+        <w:keepNext/>
+        <w:spacing w:line="240" w:lineRule="auto"/>
+        <w:jc w:val="center"/>
+      </w:pPr>
+      <w:r>
+        <w:drawing>
+          <wp:inline xmlns:a="http://schemas.openxmlformats.org/drawingml/2006/main" xmlns:pic="http://schemas.openxmlformats.org/drawingml/2006/picture">
+            <wp:extent cx="5040000" cy="2520000"/>
+            <wp:docPr id="8" name="Picture 8"/>
+            <wp:cNvGraphicFramePr>
+              <a:graphicFrameLocks noChangeAspect="1"/>
+            </wp:cNvGraphicFramePr>
+            <a:graphic>
+              <a:graphicData uri="http://schemas.openxmlformats.org/drawingml/2006/picture">
+                <pic:pic>
+                  <pic:nvPicPr>
+                    <pic:cNvPr id="0" name="bb2_s3.png"/>
+                    <pic:cNvPicPr/>
+                  </pic:nvPicPr>
+                  <pic:blipFill>
+                    <a:blip r:embed="rId17"/>
+                    <a:stretch>
+                      <a:fillRect/>
+                    </a:stretch>
+                  </pic:blipFill>
+                  <pic:spPr>
+                    <a:xfrm>
+                      <a:off x="0" y="0"/>
+                      <a:ext cx="5040000" cy="2520000"/>
+                    </a:xfrm>
+                    <a:prstGeom prst="rect"/>
+                  </pic:spPr>
+                </pic:pic>
+              </a:graphicData>
+            </a:graphic>
+          </wp:inline>
+        </w:drawing>
+      </w:r>
+    </w:p>
+    <w:p>
+      <w:pPr>
+        <w:spacing w:line="240" w:lineRule="auto" w:after="240"/>
+        <w:jc w:val="center"/>
+      </w:pPr>
+      <w:r>
+        <w:rPr>
+          <w:rFonts w:ascii="Times New Roman" w:hAnsi="Times New Roman" w:cs="Times New Roman" w:eastAsia="Times New Roman"/>
+          <w:b w:val="0"/>
+          <w:i w:val="0"/>
+          <w:sz w:val="20"/>
+        </w:rPr>
+        <w:t>Şekil 4.3.2  Şekil 3 devresinin devre tahtası yerleşimi. VS1 ve VS2 kaynakları ile toprak bağlantısı alt rayda gösterilmiştir.</w:t>
       </w:r>
     </w:p>
     <w:p>

</xml_diff>

<commit_message>
Deney 2 raporu: SPICE çıktı şekli ve ölçüm sütunları kaldırıldı
</commit_message>
<xml_diff>
--- a/ele201l_deney2_lab/build/ELE201L_Deney2_Laboratuvar_Raporu.docx
+++ b/ele201l_deney2_lab/build/ELE201L_Deney2_Laboratuvar_Raporu.docx
@@ -2271,10 +2271,9 @@
         <w:tblLook w:firstColumn="1" w:firstRow="1" w:lastColumn="0" w:lastRow="0" w:noHBand="0" w:noVBand="1" w:val="04A0"/>
       </w:tblPr>
       <w:tblGrid>
-        <w:gridCol w:w="3515"/>
-        <w:gridCol w:w="1814"/>
-        <w:gridCol w:w="1814"/>
-        <w:gridCol w:w="1814"/>
+        <w:gridCol w:w="3402"/>
+        <w:gridCol w:w="1984"/>
+        <w:gridCol w:w="1984"/>
       </w:tblGrid>
       <w:tr>
         <w:trPr>
@@ -2283,7 +2282,7 @@
         </w:trPr>
         <w:tc>
           <w:tcPr>
-            <w:tcW w:type="dxa" w:w="3515"/>
+            <w:tcW w:type="dxa" w:w="3402"/>
             <w:tcBorders>
               <w:top w:val="single" w:sz="4" w:space="0" w:color="000000"/>
               <w:left w:val="single" w:sz="4" w:space="0" w:color="000000"/>
@@ -2311,7 +2310,7 @@
         </w:tc>
         <w:tc>
           <w:tcPr>
-            <w:tcW w:type="dxa" w:w="1814"/>
+            <w:tcW w:type="dxa" w:w="1984"/>
             <w:tcBorders>
               <w:top w:val="single" w:sz="4" w:space="0" w:color="000000"/>
               <w:left w:val="single" w:sz="4" w:space="0" w:color="000000"/>
@@ -2339,7 +2338,7 @@
         </w:tc>
         <w:tc>
           <w:tcPr>
-            <w:tcW w:type="dxa" w:w="1814"/>
+            <w:tcW w:type="dxa" w:w="1984"/>
             <w:tcBorders>
               <w:top w:val="single" w:sz="4" w:space="0" w:color="000000"/>
               <w:left w:val="single" w:sz="4" w:space="0" w:color="000000"/>
@@ -2365,34 +2364,6 @@
             </w:r>
           </w:p>
         </w:tc>
-        <w:tc>
-          <w:tcPr>
-            <w:tcW w:type="dxa" w:w="1814"/>
-            <w:tcBorders>
-              <w:top w:val="single" w:sz="4" w:space="0" w:color="000000"/>
-              <w:left w:val="single" w:sz="4" w:space="0" w:color="000000"/>
-              <w:bottom w:val="single" w:sz="4" w:space="0" w:color="000000"/>
-              <w:right w:val="single" w:sz="4" w:space="0" w:color="000000"/>
-            </w:tcBorders>
-            <w:shd w:val="clear" w:color="auto" w:fill="D9D9D9"/>
-          </w:tcPr>
-          <w:p>
-            <w:pPr>
-              <w:keepNext/>
-              <w:spacing w:line="240" w:lineRule="auto" w:after="20"/>
-              <w:jc w:val="center"/>
-            </w:pPr>
-            <w:r>
-              <w:rPr>
-                <w:rFonts w:ascii="Times New Roman" w:hAnsi="Times New Roman" w:cs="Times New Roman" w:eastAsia="Times New Roman"/>
-                <w:b/>
-                <w:i w:val="0"/>
-                <w:sz w:val="20"/>
-              </w:rPr>
-              <w:t>Ölçüm</w:t>
-            </w:r>
-          </w:p>
-        </w:tc>
       </w:tr>
       <w:tr>
         <w:trPr>
@@ -2400,7 +2371,7 @@
         </w:trPr>
         <w:tc>
           <w:tcPr>
-            <w:tcW w:type="dxa" w:w="3515"/>
+            <w:tcW w:type="dxa" w:w="3402"/>
             <w:tcBorders>
               <w:top w:val="single" w:sz="4" w:space="0" w:color="000000"/>
               <w:left w:val="single" w:sz="4" w:space="0" w:color="000000"/>
@@ -2444,7 +2415,7 @@
         </w:tc>
         <w:tc>
           <w:tcPr>
-            <w:tcW w:type="dxa" w:w="1814"/>
+            <w:tcW w:type="dxa" w:w="1984"/>
             <w:tcBorders>
               <w:top w:val="single" w:sz="4" w:space="0" w:color="000000"/>
               <w:left w:val="single" w:sz="4" w:space="0" w:color="000000"/>
@@ -2471,7 +2442,7 @@
         </w:tc>
         <w:tc>
           <w:tcPr>
-            <w:tcW w:type="dxa" w:w="1814"/>
+            <w:tcW w:type="dxa" w:w="1984"/>
             <w:tcBorders>
               <w:top w:val="single" w:sz="4" w:space="0" w:color="000000"/>
               <w:left w:val="single" w:sz="4" w:space="0" w:color="000000"/>
@@ -2496,33 +2467,6 @@
             </w:r>
           </w:p>
         </w:tc>
-        <w:tc>
-          <w:tcPr>
-            <w:tcW w:type="dxa" w:w="1814"/>
-            <w:tcBorders>
-              <w:top w:val="single" w:sz="4" w:space="0" w:color="000000"/>
-              <w:left w:val="single" w:sz="4" w:space="0" w:color="000000"/>
-              <w:bottom w:val="single" w:sz="4" w:space="0" w:color="000000"/>
-              <w:right w:val="single" w:sz="4" w:space="0" w:color="000000"/>
-            </w:tcBorders>
-          </w:tcPr>
-          <w:p>
-            <w:pPr>
-              <w:keepNext/>
-              <w:spacing w:line="240" w:lineRule="auto" w:after="20"/>
-              <w:jc w:val="center"/>
-            </w:pPr>
-            <w:r>
-              <w:rPr>
-                <w:rFonts w:ascii="Times New Roman" w:hAnsi="Times New Roman" w:cs="Times New Roman" w:eastAsia="Times New Roman"/>
-                <w:b w:val="0"/>
-                <w:i w:val="0"/>
-                <w:sz w:val="20"/>
-              </w:rPr>
-              <w:t>—</w:t>
-            </w:r>
-          </w:p>
-        </w:tc>
       </w:tr>
       <w:tr>
         <w:trPr>
@@ -2530,7 +2474,7 @@
         </w:trPr>
         <w:tc>
           <w:tcPr>
-            <w:tcW w:type="dxa" w:w="3515"/>
+            <w:tcW w:type="dxa" w:w="3402"/>
             <w:tcBorders>
               <w:top w:val="single" w:sz="4" w:space="0" w:color="000000"/>
               <w:left w:val="single" w:sz="4" w:space="0" w:color="000000"/>
@@ -2574,7 +2518,7 @@
         </w:tc>
         <w:tc>
           <w:tcPr>
-            <w:tcW w:type="dxa" w:w="1814"/>
+            <w:tcW w:type="dxa" w:w="1984"/>
             <w:tcBorders>
               <w:top w:val="single" w:sz="4" w:space="0" w:color="000000"/>
               <w:left w:val="single" w:sz="4" w:space="0" w:color="000000"/>
@@ -2601,7 +2545,7 @@
         </w:tc>
         <w:tc>
           <w:tcPr>
-            <w:tcW w:type="dxa" w:w="1814"/>
+            <w:tcW w:type="dxa" w:w="1984"/>
             <w:tcBorders>
               <w:top w:val="single" w:sz="4" w:space="0" w:color="000000"/>
               <w:left w:val="single" w:sz="4" w:space="0" w:color="000000"/>
@@ -2626,33 +2570,6 @@
             </w:r>
           </w:p>
         </w:tc>
-        <w:tc>
-          <w:tcPr>
-            <w:tcW w:type="dxa" w:w="1814"/>
-            <w:tcBorders>
-              <w:top w:val="single" w:sz="4" w:space="0" w:color="000000"/>
-              <w:left w:val="single" w:sz="4" w:space="0" w:color="000000"/>
-              <w:bottom w:val="single" w:sz="4" w:space="0" w:color="000000"/>
-              <w:right w:val="single" w:sz="4" w:space="0" w:color="000000"/>
-            </w:tcBorders>
-          </w:tcPr>
-          <w:p>
-            <w:pPr>
-              <w:keepNext/>
-              <w:spacing w:line="240" w:lineRule="auto" w:after="20"/>
-              <w:jc w:val="center"/>
-            </w:pPr>
-            <w:r>
-              <w:rPr>
-                <w:rFonts w:ascii="Times New Roman" w:hAnsi="Times New Roman" w:cs="Times New Roman" w:eastAsia="Times New Roman"/>
-                <w:b w:val="0"/>
-                <w:i w:val="0"/>
-                <w:sz w:val="20"/>
-              </w:rPr>
-              <w:t>—</w:t>
-            </w:r>
-          </w:p>
-        </w:tc>
       </w:tr>
       <w:tr>
         <w:trPr>
@@ -2660,7 +2577,7 @@
         </w:trPr>
         <w:tc>
           <w:tcPr>
-            <w:tcW w:type="dxa" w:w="3515"/>
+            <w:tcW w:type="dxa" w:w="3402"/>
             <w:tcBorders>
               <w:top w:val="single" w:sz="4" w:space="0" w:color="000000"/>
               <w:left w:val="single" w:sz="4" w:space="0" w:color="000000"/>
@@ -2746,7 +2663,7 @@
         </w:tc>
         <w:tc>
           <w:tcPr>
-            <w:tcW w:type="dxa" w:w="1814"/>
+            <w:tcW w:type="dxa" w:w="1984"/>
             <w:tcBorders>
               <w:top w:val="single" w:sz="4" w:space="0" w:color="000000"/>
               <w:left w:val="single" w:sz="4" w:space="0" w:color="000000"/>
@@ -2773,7 +2690,7 @@
         </w:tc>
         <w:tc>
           <w:tcPr>
-            <w:tcW w:type="dxa" w:w="1814"/>
+            <w:tcW w:type="dxa" w:w="1984"/>
             <w:tcBorders>
               <w:top w:val="single" w:sz="4" w:space="0" w:color="000000"/>
               <w:left w:val="single" w:sz="4" w:space="0" w:color="000000"/>
@@ -2798,33 +2715,6 @@
             </w:r>
           </w:p>
         </w:tc>
-        <w:tc>
-          <w:tcPr>
-            <w:tcW w:type="dxa" w:w="1814"/>
-            <w:tcBorders>
-              <w:top w:val="single" w:sz="4" w:space="0" w:color="000000"/>
-              <w:left w:val="single" w:sz="4" w:space="0" w:color="000000"/>
-              <w:bottom w:val="single" w:sz="4" w:space="0" w:color="000000"/>
-              <w:right w:val="single" w:sz="4" w:space="0" w:color="000000"/>
-            </w:tcBorders>
-          </w:tcPr>
-          <w:p>
-            <w:pPr>
-              <w:keepNext/>
-              <w:spacing w:line="240" w:lineRule="auto" w:after="20"/>
-              <w:jc w:val="center"/>
-            </w:pPr>
-            <w:r>
-              <w:rPr>
-                <w:rFonts w:ascii="Times New Roman" w:hAnsi="Times New Roman" w:cs="Times New Roman" w:eastAsia="Times New Roman"/>
-                <w:b w:val="0"/>
-                <w:i w:val="0"/>
-                <w:sz w:val="20"/>
-              </w:rPr>
-              <w:t>—</w:t>
-            </w:r>
-          </w:p>
-        </w:tc>
       </w:tr>
       <w:tr>
         <w:trPr>
@@ -2832,7 +2722,7 @@
         </w:trPr>
         <w:tc>
           <w:tcPr>
-            <w:tcW w:type="dxa" w:w="3515"/>
+            <w:tcW w:type="dxa" w:w="3402"/>
             <w:tcBorders>
               <w:top w:val="single" w:sz="4" w:space="0" w:color="000000"/>
               <w:left w:val="single" w:sz="4" w:space="0" w:color="000000"/>
@@ -2876,7 +2766,7 @@
         </w:tc>
         <w:tc>
           <w:tcPr>
-            <w:tcW w:type="dxa" w:w="1814"/>
+            <w:tcW w:type="dxa" w:w="1984"/>
             <w:tcBorders>
               <w:top w:val="single" w:sz="4" w:space="0" w:color="000000"/>
               <w:left w:val="single" w:sz="4" w:space="0" w:color="000000"/>
@@ -2903,7 +2793,7 @@
         </w:tc>
         <w:tc>
           <w:tcPr>
-            <w:tcW w:type="dxa" w:w="1814"/>
+            <w:tcW w:type="dxa" w:w="1984"/>
             <w:tcBorders>
               <w:top w:val="single" w:sz="4" w:space="0" w:color="000000"/>
               <w:left w:val="single" w:sz="4" w:space="0" w:color="000000"/>
@@ -2928,95 +2818,12 @@
             </w:r>
           </w:p>
         </w:tc>
-        <w:tc>
-          <w:tcPr>
-            <w:tcW w:type="dxa" w:w="1814"/>
-            <w:tcBorders>
-              <w:top w:val="single" w:sz="4" w:space="0" w:color="000000"/>
-              <w:left w:val="single" w:sz="4" w:space="0" w:color="000000"/>
-              <w:bottom w:val="single" w:sz="4" w:space="0" w:color="000000"/>
-              <w:right w:val="single" w:sz="4" w:space="0" w:color="000000"/>
-            </w:tcBorders>
-          </w:tcPr>
-          <w:p>
-            <w:pPr>
-              <w:keepNext w:val="0"/>
-              <w:spacing w:line="240" w:lineRule="auto" w:after="20"/>
-              <w:jc w:val="center"/>
-            </w:pPr>
-            <w:r>
-              <w:rPr>
-                <w:rFonts w:ascii="Times New Roman" w:hAnsi="Times New Roman" w:cs="Times New Roman" w:eastAsia="Times New Roman"/>
-                <w:b w:val="0"/>
-                <w:i w:val="0"/>
-                <w:sz w:val="20"/>
-              </w:rPr>
-              <w:t>—</w:t>
-            </w:r>
-          </w:p>
-        </w:tc>
       </w:tr>
     </w:tbl>
     <w:p>
       <w:pPr>
         <w:spacing w:after="120"/>
       </w:pPr>
-    </w:p>
-    <w:p>
-      <w:pPr>
-        <w:keepNext/>
-        <w:spacing w:line="240" w:lineRule="auto"/>
-        <w:jc w:val="center"/>
-      </w:pPr>
-      <w:r>
-        <w:drawing>
-          <wp:inline xmlns:a="http://schemas.openxmlformats.org/drawingml/2006/main" xmlns:pic="http://schemas.openxmlformats.org/drawingml/2006/picture">
-            <wp:extent cx="4680000" cy="1653600"/>
-            <wp:docPr id="4" name="Picture 4"/>
-            <wp:cNvGraphicFramePr>
-              <a:graphicFrameLocks noChangeAspect="1"/>
-            </wp:cNvGraphicFramePr>
-            <a:graphic>
-              <a:graphicData uri="http://schemas.openxmlformats.org/drawingml/2006/picture">
-                <pic:pic>
-                  <pic:nvPicPr>
-                    <pic:cNvPr id="0" name="spice_cikti.png"/>
-                    <pic:cNvPicPr/>
-                  </pic:nvPicPr>
-                  <pic:blipFill>
-                    <a:blip r:embed="rId13"/>
-                    <a:stretch>
-                      <a:fillRect/>
-                    </a:stretch>
-                  </pic:blipFill>
-                  <pic:spPr>
-                    <a:xfrm>
-                      <a:off x="0" y="0"/>
-                      <a:ext cx="4680000" cy="1653600"/>
-                    </a:xfrm>
-                    <a:prstGeom prst="rect"/>
-                  </pic:spPr>
-                </pic:pic>
-              </a:graphicData>
-            </a:graphic>
-          </wp:inline>
-        </w:drawing>
-      </w:r>
-    </w:p>
-    <w:p>
-      <w:pPr>
-        <w:spacing w:line="240" w:lineRule="auto" w:after="240"/>
-        <w:jc w:val="center"/>
-      </w:pPr>
-      <w:r>
-        <w:rPr>
-          <w:rFonts w:ascii="Times New Roman" w:hAnsi="Times New Roman" w:cs="Times New Roman" w:eastAsia="Times New Roman"/>
-          <w:b w:val="0"/>
-          <w:i w:val="0"/>
-          <w:sz w:val="20"/>
-        </w:rPr>
-        <w:t>Şekil 4.1.3  Şekil 1 devresinin ngspice (batch modu) ile çalıştırılmış analiz çıktısı. Bu bir simülasyon çıktısıdır, laboratuvar ölçümü değildir.</w:t>
-      </w:r>
     </w:p>
     <w:p>
       <w:pPr>
@@ -3199,7 +3006,7 @@
         <w:drawing>
           <wp:inline xmlns:a="http://schemas.openxmlformats.org/drawingml/2006/main" xmlns:pic="http://schemas.openxmlformats.org/drawingml/2006/picture">
             <wp:extent cx="2880000" cy="1508571"/>
-            <wp:docPr id="5" name="Picture 5"/>
+            <wp:docPr id="4" name="Picture 4"/>
             <wp:cNvGraphicFramePr>
               <a:graphicFrameLocks noChangeAspect="1"/>
             </wp:cNvGraphicFramePr>
@@ -3211,7 +3018,7 @@
                     <pic:cNvPicPr/>
                   </pic:nvPicPr>
                   <pic:blipFill>
-                    <a:blip r:embed="rId14"/>
+                    <a:blip r:embed="rId13"/>
                     <a:stretch>
                       <a:fillRect/>
                     </a:stretch>
@@ -3301,7 +3108,7 @@
         <w:drawing>
           <wp:inline xmlns:a="http://schemas.openxmlformats.org/drawingml/2006/main" xmlns:pic="http://schemas.openxmlformats.org/drawingml/2006/picture">
             <wp:extent cx="5040000" cy="2100000"/>
-            <wp:docPr id="6" name="Picture 6"/>
+            <wp:docPr id="5" name="Picture 5"/>
             <wp:cNvGraphicFramePr>
               <a:graphicFrameLocks noChangeAspect="1"/>
             </wp:cNvGraphicFramePr>
@@ -3313,7 +3120,7 @@
                     <pic:cNvPicPr/>
                   </pic:nvPicPr>
                   <pic:blipFill>
-                    <a:blip r:embed="rId15"/>
+                    <a:blip r:embed="rId14"/>
                     <a:stretch>
                       <a:fillRect/>
                     </a:stretch>
@@ -4388,10 +4195,9 @@
         <w:tblLook w:firstColumn="1" w:firstRow="1" w:lastColumn="0" w:lastRow="0" w:noHBand="0" w:noVBand="1" w:val="04A0"/>
       </w:tblPr>
       <w:tblGrid>
-        <w:gridCol w:w="3515"/>
-        <w:gridCol w:w="1814"/>
-        <w:gridCol w:w="1814"/>
-        <w:gridCol w:w="1814"/>
+        <w:gridCol w:w="3402"/>
+        <w:gridCol w:w="1984"/>
+        <w:gridCol w:w="1984"/>
       </w:tblGrid>
       <w:tr>
         <w:trPr>
@@ -4400,7 +4206,7 @@
         </w:trPr>
         <w:tc>
           <w:tcPr>
-            <w:tcW w:type="dxa" w:w="3515"/>
+            <w:tcW w:type="dxa" w:w="3402"/>
             <w:tcBorders>
               <w:top w:val="single" w:sz="4" w:space="0" w:color="000000"/>
               <w:left w:val="single" w:sz="4" w:space="0" w:color="000000"/>
@@ -4428,7 +4234,7 @@
         </w:tc>
         <w:tc>
           <w:tcPr>
-            <w:tcW w:type="dxa" w:w="1814"/>
+            <w:tcW w:type="dxa" w:w="1984"/>
             <w:tcBorders>
               <w:top w:val="single" w:sz="4" w:space="0" w:color="000000"/>
               <w:left w:val="single" w:sz="4" w:space="0" w:color="000000"/>
@@ -4456,7 +4262,7 @@
         </w:tc>
         <w:tc>
           <w:tcPr>
-            <w:tcW w:type="dxa" w:w="1814"/>
+            <w:tcW w:type="dxa" w:w="1984"/>
             <w:tcBorders>
               <w:top w:val="single" w:sz="4" w:space="0" w:color="000000"/>
               <w:left w:val="single" w:sz="4" w:space="0" w:color="000000"/>
@@ -4482,34 +4288,6 @@
             </w:r>
           </w:p>
         </w:tc>
-        <w:tc>
-          <w:tcPr>
-            <w:tcW w:type="dxa" w:w="1814"/>
-            <w:tcBorders>
-              <w:top w:val="single" w:sz="4" w:space="0" w:color="000000"/>
-              <w:left w:val="single" w:sz="4" w:space="0" w:color="000000"/>
-              <w:bottom w:val="single" w:sz="4" w:space="0" w:color="000000"/>
-              <w:right w:val="single" w:sz="4" w:space="0" w:color="000000"/>
-            </w:tcBorders>
-            <w:shd w:val="clear" w:color="auto" w:fill="D9D9D9"/>
-          </w:tcPr>
-          <w:p>
-            <w:pPr>
-              <w:keepNext/>
-              <w:spacing w:line="240" w:lineRule="auto" w:after="20"/>
-              <w:jc w:val="center"/>
-            </w:pPr>
-            <w:r>
-              <w:rPr>
-                <w:rFonts w:ascii="Times New Roman" w:hAnsi="Times New Roman" w:cs="Times New Roman" w:eastAsia="Times New Roman"/>
-                <w:b/>
-                <w:i w:val="0"/>
-                <w:sz w:val="20"/>
-              </w:rPr>
-              <w:t>Ölçüm</w:t>
-            </w:r>
-          </w:p>
-        </w:tc>
       </w:tr>
       <w:tr>
         <w:trPr>
@@ -4517,7 +4295,7 @@
         </w:trPr>
         <w:tc>
           <w:tcPr>
-            <w:tcW w:type="dxa" w:w="3515"/>
+            <w:tcW w:type="dxa" w:w="3402"/>
             <w:tcBorders>
               <w:top w:val="single" w:sz="4" w:space="0" w:color="000000"/>
               <w:left w:val="single" w:sz="4" w:space="0" w:color="000000"/>
@@ -4558,7 +4336,7 @@
         </w:tc>
         <w:tc>
           <w:tcPr>
-            <w:tcW w:type="dxa" w:w="1814"/>
+            <w:tcW w:type="dxa" w:w="1984"/>
             <w:tcBorders>
               <w:top w:val="single" w:sz="4" w:space="0" w:color="000000"/>
               <w:left w:val="single" w:sz="4" w:space="0" w:color="000000"/>
@@ -4585,7 +4363,7 @@
         </w:tc>
         <w:tc>
           <w:tcPr>
-            <w:tcW w:type="dxa" w:w="1814"/>
+            <w:tcW w:type="dxa" w:w="1984"/>
             <w:tcBorders>
               <w:top w:val="single" w:sz="4" w:space="0" w:color="000000"/>
               <w:left w:val="single" w:sz="4" w:space="0" w:color="000000"/>
@@ -4610,33 +4388,6 @@
             </w:r>
           </w:p>
         </w:tc>
-        <w:tc>
-          <w:tcPr>
-            <w:tcW w:type="dxa" w:w="1814"/>
-            <w:tcBorders>
-              <w:top w:val="single" w:sz="4" w:space="0" w:color="000000"/>
-              <w:left w:val="single" w:sz="4" w:space="0" w:color="000000"/>
-              <w:bottom w:val="single" w:sz="4" w:space="0" w:color="000000"/>
-              <w:right w:val="single" w:sz="4" w:space="0" w:color="000000"/>
-            </w:tcBorders>
-          </w:tcPr>
-          <w:p>
-            <w:pPr>
-              <w:keepNext/>
-              <w:spacing w:line="240" w:lineRule="auto" w:after="20"/>
-              <w:jc w:val="center"/>
-            </w:pPr>
-            <w:r>
-              <w:rPr>
-                <w:rFonts w:ascii="Times New Roman" w:hAnsi="Times New Roman" w:cs="Times New Roman" w:eastAsia="Times New Roman"/>
-                <w:b w:val="0"/>
-                <w:i w:val="0"/>
-                <w:sz w:val="20"/>
-              </w:rPr>
-              <w:t>—</w:t>
-            </w:r>
-          </w:p>
-        </w:tc>
       </w:tr>
       <w:tr>
         <w:trPr>
@@ -4644,7 +4395,7 @@
         </w:trPr>
         <w:tc>
           <w:tcPr>
-            <w:tcW w:type="dxa" w:w="3515"/>
+            <w:tcW w:type="dxa" w:w="3402"/>
             <w:tcBorders>
               <w:top w:val="single" w:sz="4" w:space="0" w:color="000000"/>
               <w:left w:val="single" w:sz="4" w:space="0" w:color="000000"/>
@@ -4685,7 +4436,7 @@
         </w:tc>
         <w:tc>
           <w:tcPr>
-            <w:tcW w:type="dxa" w:w="1814"/>
+            <w:tcW w:type="dxa" w:w="1984"/>
             <w:tcBorders>
               <w:top w:val="single" w:sz="4" w:space="0" w:color="000000"/>
               <w:left w:val="single" w:sz="4" w:space="0" w:color="000000"/>
@@ -4712,7 +4463,7 @@
         </w:tc>
         <w:tc>
           <w:tcPr>
-            <w:tcW w:type="dxa" w:w="1814"/>
+            <w:tcW w:type="dxa" w:w="1984"/>
             <w:tcBorders>
               <w:top w:val="single" w:sz="4" w:space="0" w:color="000000"/>
               <w:left w:val="single" w:sz="4" w:space="0" w:color="000000"/>
@@ -4737,33 +4488,6 @@
             </w:r>
           </w:p>
         </w:tc>
-        <w:tc>
-          <w:tcPr>
-            <w:tcW w:type="dxa" w:w="1814"/>
-            <w:tcBorders>
-              <w:top w:val="single" w:sz="4" w:space="0" w:color="000000"/>
-              <w:left w:val="single" w:sz="4" w:space="0" w:color="000000"/>
-              <w:bottom w:val="single" w:sz="4" w:space="0" w:color="000000"/>
-              <w:right w:val="single" w:sz="4" w:space="0" w:color="000000"/>
-            </w:tcBorders>
-          </w:tcPr>
-          <w:p>
-            <w:pPr>
-              <w:keepNext/>
-              <w:spacing w:line="240" w:lineRule="auto" w:after="20"/>
-              <w:jc w:val="center"/>
-            </w:pPr>
-            <w:r>
-              <w:rPr>
-                <w:rFonts w:ascii="Times New Roman" w:hAnsi="Times New Roman" w:cs="Times New Roman" w:eastAsia="Times New Roman"/>
-                <w:b w:val="0"/>
-                <w:i w:val="0"/>
-                <w:sz w:val="20"/>
-              </w:rPr>
-              <w:t>—</w:t>
-            </w:r>
-          </w:p>
-        </w:tc>
       </w:tr>
       <w:tr>
         <w:trPr>
@@ -4771,7 +4495,7 @@
         </w:trPr>
         <w:tc>
           <w:tcPr>
-            <w:tcW w:type="dxa" w:w="3515"/>
+            <w:tcW w:type="dxa" w:w="3402"/>
             <w:tcBorders>
               <w:top w:val="single" w:sz="4" w:space="0" w:color="000000"/>
               <w:left w:val="single" w:sz="4" w:space="0" w:color="000000"/>
@@ -4812,7 +4536,7 @@
         </w:tc>
         <w:tc>
           <w:tcPr>
-            <w:tcW w:type="dxa" w:w="1814"/>
+            <w:tcW w:type="dxa" w:w="1984"/>
             <w:tcBorders>
               <w:top w:val="single" w:sz="4" w:space="0" w:color="000000"/>
               <w:left w:val="single" w:sz="4" w:space="0" w:color="000000"/>
@@ -4839,7 +4563,7 @@
         </w:tc>
         <w:tc>
           <w:tcPr>
-            <w:tcW w:type="dxa" w:w="1814"/>
+            <w:tcW w:type="dxa" w:w="1984"/>
             <w:tcBorders>
               <w:top w:val="single" w:sz="4" w:space="0" w:color="000000"/>
               <w:left w:val="single" w:sz="4" w:space="0" w:color="000000"/>
@@ -4864,33 +4588,6 @@
             </w:r>
           </w:p>
         </w:tc>
-        <w:tc>
-          <w:tcPr>
-            <w:tcW w:type="dxa" w:w="1814"/>
-            <w:tcBorders>
-              <w:top w:val="single" w:sz="4" w:space="0" w:color="000000"/>
-              <w:left w:val="single" w:sz="4" w:space="0" w:color="000000"/>
-              <w:bottom w:val="single" w:sz="4" w:space="0" w:color="000000"/>
-              <w:right w:val="single" w:sz="4" w:space="0" w:color="000000"/>
-            </w:tcBorders>
-          </w:tcPr>
-          <w:p>
-            <w:pPr>
-              <w:keepNext/>
-              <w:spacing w:line="240" w:lineRule="auto" w:after="20"/>
-              <w:jc w:val="center"/>
-            </w:pPr>
-            <w:r>
-              <w:rPr>
-                <w:rFonts w:ascii="Times New Roman" w:hAnsi="Times New Roman" w:cs="Times New Roman" w:eastAsia="Times New Roman"/>
-                <w:b w:val="0"/>
-                <w:i w:val="0"/>
-                <w:sz w:val="20"/>
-              </w:rPr>
-              <w:t>—</w:t>
-            </w:r>
-          </w:p>
-        </w:tc>
       </w:tr>
       <w:tr>
         <w:trPr>
@@ -4898,7 +4595,7 @@
         </w:trPr>
         <w:tc>
           <w:tcPr>
-            <w:tcW w:type="dxa" w:w="3515"/>
+            <w:tcW w:type="dxa" w:w="3402"/>
             <w:tcBorders>
               <w:top w:val="single" w:sz="4" w:space="0" w:color="000000"/>
               <w:left w:val="single" w:sz="4" w:space="0" w:color="000000"/>
@@ -4939,7 +4636,7 @@
         </w:tc>
         <w:tc>
           <w:tcPr>
-            <w:tcW w:type="dxa" w:w="1814"/>
+            <w:tcW w:type="dxa" w:w="1984"/>
             <w:tcBorders>
               <w:top w:val="single" w:sz="4" w:space="0" w:color="000000"/>
               <w:left w:val="single" w:sz="4" w:space="0" w:color="000000"/>
@@ -4966,7 +4663,7 @@
         </w:tc>
         <w:tc>
           <w:tcPr>
-            <w:tcW w:type="dxa" w:w="1814"/>
+            <w:tcW w:type="dxa" w:w="1984"/>
             <w:tcBorders>
               <w:top w:val="single" w:sz="4" w:space="0" w:color="000000"/>
               <w:left w:val="single" w:sz="4" w:space="0" w:color="000000"/>
@@ -4988,33 +4685,6 @@
                 <w:sz w:val="20"/>
               </w:rPr>
               <w:t>2,557</w:t>
-            </w:r>
-          </w:p>
-        </w:tc>
-        <w:tc>
-          <w:tcPr>
-            <w:tcW w:type="dxa" w:w="1814"/>
-            <w:tcBorders>
-              <w:top w:val="single" w:sz="4" w:space="0" w:color="000000"/>
-              <w:left w:val="single" w:sz="4" w:space="0" w:color="000000"/>
-              <w:bottom w:val="single" w:sz="4" w:space="0" w:color="000000"/>
-              <w:right w:val="single" w:sz="4" w:space="0" w:color="000000"/>
-            </w:tcBorders>
-          </w:tcPr>
-          <w:p>
-            <w:pPr>
-              <w:keepNext w:val="0"/>
-              <w:spacing w:line="240" w:lineRule="auto" w:after="20"/>
-              <w:jc w:val="center"/>
-            </w:pPr>
-            <w:r>
-              <w:rPr>
-                <w:rFonts w:ascii="Times New Roman" w:hAnsi="Times New Roman" w:cs="Times New Roman" w:eastAsia="Times New Roman"/>
-                <w:b w:val="0"/>
-                <w:i w:val="0"/>
-                <w:sz w:val="20"/>
-              </w:rPr>
-              <w:t>—</w:t>
             </w:r>
           </w:p>
         </w:tc>
@@ -5369,7 +5039,7 @@
         <w:drawing>
           <wp:inline xmlns:a="http://schemas.openxmlformats.org/drawingml/2006/main" xmlns:pic="http://schemas.openxmlformats.org/drawingml/2006/picture">
             <wp:extent cx="3240000" cy="2068085"/>
-            <wp:docPr id="7" name="Picture 7"/>
+            <wp:docPr id="6" name="Picture 6"/>
             <wp:cNvGraphicFramePr>
               <a:graphicFrameLocks noChangeAspect="1"/>
             </wp:cNvGraphicFramePr>
@@ -5381,7 +5051,7 @@
                     <pic:cNvPicPr/>
                   </pic:nvPicPr>
                   <pic:blipFill>
-                    <a:blip r:embed="rId16"/>
+                    <a:blip r:embed="rId15"/>
                     <a:stretch>
                       <a:fillRect/>
                     </a:stretch>
@@ -5425,7 +5095,7 @@
         <w:drawing>
           <wp:inline xmlns:a="http://schemas.openxmlformats.org/drawingml/2006/main" xmlns:pic="http://schemas.openxmlformats.org/drawingml/2006/picture">
             <wp:extent cx="5040000" cy="2520000"/>
-            <wp:docPr id="8" name="Picture 8"/>
+            <wp:docPr id="7" name="Picture 7"/>
             <wp:cNvGraphicFramePr>
               <a:graphicFrameLocks noChangeAspect="1"/>
             </wp:cNvGraphicFramePr>
@@ -5437,7 +5107,7 @@
                     <pic:cNvPicPr/>
                   </pic:nvPicPr>
                   <pic:blipFill>
-                    <a:blip r:embed="rId17"/>
+                    <a:blip r:embed="rId16"/>
                     <a:stretch>
                       <a:fillRect/>
                     </a:stretch>
@@ -7607,10 +7277,9 @@
         <w:tblLook w:firstColumn="1" w:firstRow="1" w:lastColumn="0" w:lastRow="0" w:noHBand="0" w:noVBand="1" w:val="04A0"/>
       </w:tblPr>
       <w:tblGrid>
-        <w:gridCol w:w="3515"/>
-        <w:gridCol w:w="1814"/>
-        <w:gridCol w:w="1814"/>
-        <w:gridCol w:w="1814"/>
+        <w:gridCol w:w="3402"/>
+        <w:gridCol w:w="1984"/>
+        <w:gridCol w:w="1984"/>
       </w:tblGrid>
       <w:tr>
         <w:trPr>
@@ -7619,7 +7288,7 @@
         </w:trPr>
         <w:tc>
           <w:tcPr>
-            <w:tcW w:type="dxa" w:w="3515"/>
+            <w:tcW w:type="dxa" w:w="3402"/>
             <w:tcBorders>
               <w:top w:val="single" w:sz="4" w:space="0" w:color="000000"/>
               <w:left w:val="single" w:sz="4" w:space="0" w:color="000000"/>
@@ -7647,7 +7316,7 @@
         </w:tc>
         <w:tc>
           <w:tcPr>
-            <w:tcW w:type="dxa" w:w="1814"/>
+            <w:tcW w:type="dxa" w:w="1984"/>
             <w:tcBorders>
               <w:top w:val="single" w:sz="4" w:space="0" w:color="000000"/>
               <w:left w:val="single" w:sz="4" w:space="0" w:color="000000"/>
@@ -7675,7 +7344,7 @@
         </w:tc>
         <w:tc>
           <w:tcPr>
-            <w:tcW w:type="dxa" w:w="1814"/>
+            <w:tcW w:type="dxa" w:w="1984"/>
             <w:tcBorders>
               <w:top w:val="single" w:sz="4" w:space="0" w:color="000000"/>
               <w:left w:val="single" w:sz="4" w:space="0" w:color="000000"/>
@@ -7701,34 +7370,6 @@
             </w:r>
           </w:p>
         </w:tc>
-        <w:tc>
-          <w:tcPr>
-            <w:tcW w:type="dxa" w:w="1814"/>
-            <w:tcBorders>
-              <w:top w:val="single" w:sz="4" w:space="0" w:color="000000"/>
-              <w:left w:val="single" w:sz="4" w:space="0" w:color="000000"/>
-              <w:bottom w:val="single" w:sz="4" w:space="0" w:color="000000"/>
-              <w:right w:val="single" w:sz="4" w:space="0" w:color="000000"/>
-            </w:tcBorders>
-            <w:shd w:val="clear" w:color="auto" w:fill="D9D9D9"/>
-          </w:tcPr>
-          <w:p>
-            <w:pPr>
-              <w:keepNext/>
-              <w:spacing w:line="240" w:lineRule="auto" w:after="20"/>
-              <w:jc w:val="center"/>
-            </w:pPr>
-            <w:r>
-              <w:rPr>
-                <w:rFonts w:ascii="Times New Roman" w:hAnsi="Times New Roman" w:cs="Times New Roman" w:eastAsia="Times New Roman"/>
-                <w:b/>
-                <w:i w:val="0"/>
-                <w:sz w:val="20"/>
-              </w:rPr>
-              <w:t>Ölçüm</w:t>
-            </w:r>
-          </w:p>
-        </w:tc>
       </w:tr>
       <w:tr>
         <w:trPr>
@@ -7736,7 +7377,7 @@
         </w:trPr>
         <w:tc>
           <w:tcPr>
-            <w:tcW w:type="dxa" w:w="3515"/>
+            <w:tcW w:type="dxa" w:w="3402"/>
             <w:tcBorders>
               <w:top w:val="single" w:sz="4" w:space="0" w:color="000000"/>
               <w:left w:val="single" w:sz="4" w:space="0" w:color="000000"/>
@@ -7780,7 +7421,7 @@
         </w:tc>
         <w:tc>
           <w:tcPr>
-            <w:tcW w:type="dxa" w:w="1814"/>
+            <w:tcW w:type="dxa" w:w="1984"/>
             <w:tcBorders>
               <w:top w:val="single" w:sz="4" w:space="0" w:color="000000"/>
               <w:left w:val="single" w:sz="4" w:space="0" w:color="000000"/>
@@ -7807,7 +7448,7 @@
         </w:tc>
         <w:tc>
           <w:tcPr>
-            <w:tcW w:type="dxa" w:w="1814"/>
+            <w:tcW w:type="dxa" w:w="1984"/>
             <w:tcBorders>
               <w:top w:val="single" w:sz="4" w:space="0" w:color="000000"/>
               <w:left w:val="single" w:sz="4" w:space="0" w:color="000000"/>
@@ -7832,33 +7473,6 @@
             </w:r>
           </w:p>
         </w:tc>
-        <w:tc>
-          <w:tcPr>
-            <w:tcW w:type="dxa" w:w="1814"/>
-            <w:tcBorders>
-              <w:top w:val="single" w:sz="4" w:space="0" w:color="000000"/>
-              <w:left w:val="single" w:sz="4" w:space="0" w:color="000000"/>
-              <w:bottom w:val="single" w:sz="4" w:space="0" w:color="000000"/>
-              <w:right w:val="single" w:sz="4" w:space="0" w:color="000000"/>
-            </w:tcBorders>
-          </w:tcPr>
-          <w:p>
-            <w:pPr>
-              <w:keepNext/>
-              <w:spacing w:line="240" w:lineRule="auto" w:after="20"/>
-              <w:jc w:val="center"/>
-            </w:pPr>
-            <w:r>
-              <w:rPr>
-                <w:rFonts w:ascii="Times New Roman" w:hAnsi="Times New Roman" w:cs="Times New Roman" w:eastAsia="Times New Roman"/>
-                <w:b w:val="0"/>
-                <w:i w:val="0"/>
-                <w:sz w:val="20"/>
-              </w:rPr>
-              <w:t>—</w:t>
-            </w:r>
-          </w:p>
-        </w:tc>
       </w:tr>
       <w:tr>
         <w:trPr>
@@ -7866,7 +7480,7 @@
         </w:trPr>
         <w:tc>
           <w:tcPr>
-            <w:tcW w:type="dxa" w:w="3515"/>
+            <w:tcW w:type="dxa" w:w="3402"/>
             <w:tcBorders>
               <w:top w:val="single" w:sz="4" w:space="0" w:color="000000"/>
               <w:left w:val="single" w:sz="4" w:space="0" w:color="000000"/>
@@ -7936,7 +7550,7 @@
         </w:tc>
         <w:tc>
           <w:tcPr>
-            <w:tcW w:type="dxa" w:w="1814"/>
+            <w:tcW w:type="dxa" w:w="1984"/>
             <w:tcBorders>
               <w:top w:val="single" w:sz="4" w:space="0" w:color="000000"/>
               <w:left w:val="single" w:sz="4" w:space="0" w:color="000000"/>
@@ -7963,7 +7577,7 @@
         </w:tc>
         <w:tc>
           <w:tcPr>
-            <w:tcW w:type="dxa" w:w="1814"/>
+            <w:tcW w:type="dxa" w:w="1984"/>
             <w:tcBorders>
               <w:top w:val="single" w:sz="4" w:space="0" w:color="000000"/>
               <w:left w:val="single" w:sz="4" w:space="0" w:color="000000"/>
@@ -7988,33 +7602,6 @@
             </w:r>
           </w:p>
         </w:tc>
-        <w:tc>
-          <w:tcPr>
-            <w:tcW w:type="dxa" w:w="1814"/>
-            <w:tcBorders>
-              <w:top w:val="single" w:sz="4" w:space="0" w:color="000000"/>
-              <w:left w:val="single" w:sz="4" w:space="0" w:color="000000"/>
-              <w:bottom w:val="single" w:sz="4" w:space="0" w:color="000000"/>
-              <w:right w:val="single" w:sz="4" w:space="0" w:color="000000"/>
-            </w:tcBorders>
-          </w:tcPr>
-          <w:p>
-            <w:pPr>
-              <w:keepNext/>
-              <w:spacing w:line="240" w:lineRule="auto" w:after="20"/>
-              <w:jc w:val="center"/>
-            </w:pPr>
-            <w:r>
-              <w:rPr>
-                <w:rFonts w:ascii="Times New Roman" w:hAnsi="Times New Roman" w:cs="Times New Roman" w:eastAsia="Times New Roman"/>
-                <w:b w:val="0"/>
-                <w:i w:val="0"/>
-                <w:sz w:val="20"/>
-              </w:rPr>
-              <w:t>—</w:t>
-            </w:r>
-          </w:p>
-        </w:tc>
       </w:tr>
       <w:tr>
         <w:trPr>
@@ -8022,7 +7609,7 @@
         </w:trPr>
         <w:tc>
           <w:tcPr>
-            <w:tcW w:type="dxa" w:w="3515"/>
+            <w:tcW w:type="dxa" w:w="3402"/>
             <w:tcBorders>
               <w:top w:val="single" w:sz="4" w:space="0" w:color="000000"/>
               <w:left w:val="single" w:sz="4" w:space="0" w:color="000000"/>
@@ -8092,7 +7679,7 @@
         </w:tc>
         <w:tc>
           <w:tcPr>
-            <w:tcW w:type="dxa" w:w="1814"/>
+            <w:tcW w:type="dxa" w:w="1984"/>
             <w:tcBorders>
               <w:top w:val="single" w:sz="4" w:space="0" w:color="000000"/>
               <w:left w:val="single" w:sz="4" w:space="0" w:color="000000"/>
@@ -8119,7 +7706,7 @@
         </w:tc>
         <w:tc>
           <w:tcPr>
-            <w:tcW w:type="dxa" w:w="1814"/>
+            <w:tcW w:type="dxa" w:w="1984"/>
             <w:tcBorders>
               <w:top w:val="single" w:sz="4" w:space="0" w:color="000000"/>
               <w:left w:val="single" w:sz="4" w:space="0" w:color="000000"/>
@@ -8144,33 +7731,6 @@
             </w:r>
           </w:p>
         </w:tc>
-        <w:tc>
-          <w:tcPr>
-            <w:tcW w:type="dxa" w:w="1814"/>
-            <w:tcBorders>
-              <w:top w:val="single" w:sz="4" w:space="0" w:color="000000"/>
-              <w:left w:val="single" w:sz="4" w:space="0" w:color="000000"/>
-              <w:bottom w:val="single" w:sz="4" w:space="0" w:color="000000"/>
-              <w:right w:val="single" w:sz="4" w:space="0" w:color="000000"/>
-            </w:tcBorders>
-          </w:tcPr>
-          <w:p>
-            <w:pPr>
-              <w:keepNext/>
-              <w:spacing w:line="240" w:lineRule="auto" w:after="20"/>
-              <w:jc w:val="center"/>
-            </w:pPr>
-            <w:r>
-              <w:rPr>
-                <w:rFonts w:ascii="Times New Roman" w:hAnsi="Times New Roman" w:cs="Times New Roman" w:eastAsia="Times New Roman"/>
-                <w:b w:val="0"/>
-                <w:i w:val="0"/>
-                <w:sz w:val="20"/>
-              </w:rPr>
-              <w:t>—</w:t>
-            </w:r>
-          </w:p>
-        </w:tc>
       </w:tr>
       <w:tr>
         <w:trPr>
@@ -8178,7 +7738,7 @@
         </w:trPr>
         <w:tc>
           <w:tcPr>
-            <w:tcW w:type="dxa" w:w="3515"/>
+            <w:tcW w:type="dxa" w:w="3402"/>
             <w:tcBorders>
               <w:top w:val="single" w:sz="4" w:space="0" w:color="000000"/>
               <w:left w:val="single" w:sz="4" w:space="0" w:color="000000"/>
@@ -8222,7 +7782,7 @@
         </w:tc>
         <w:tc>
           <w:tcPr>
-            <w:tcW w:type="dxa" w:w="1814"/>
+            <w:tcW w:type="dxa" w:w="1984"/>
             <w:tcBorders>
               <w:top w:val="single" w:sz="4" w:space="0" w:color="000000"/>
               <w:left w:val="single" w:sz="4" w:space="0" w:color="000000"/>
@@ -8249,7 +7809,7 @@
         </w:tc>
         <w:tc>
           <w:tcPr>
-            <w:tcW w:type="dxa" w:w="1814"/>
+            <w:tcW w:type="dxa" w:w="1984"/>
             <w:tcBorders>
               <w:top w:val="single" w:sz="4" w:space="0" w:color="000000"/>
               <w:left w:val="single" w:sz="4" w:space="0" w:color="000000"/>
@@ -8274,33 +7834,6 @@
             </w:r>
           </w:p>
         </w:tc>
-        <w:tc>
-          <w:tcPr>
-            <w:tcW w:type="dxa" w:w="1814"/>
-            <w:tcBorders>
-              <w:top w:val="single" w:sz="4" w:space="0" w:color="000000"/>
-              <w:left w:val="single" w:sz="4" w:space="0" w:color="000000"/>
-              <w:bottom w:val="single" w:sz="4" w:space="0" w:color="000000"/>
-              <w:right w:val="single" w:sz="4" w:space="0" w:color="000000"/>
-            </w:tcBorders>
-          </w:tcPr>
-          <w:p>
-            <w:pPr>
-              <w:keepNext/>
-              <w:spacing w:line="240" w:lineRule="auto" w:after="20"/>
-              <w:jc w:val="center"/>
-            </w:pPr>
-            <w:r>
-              <w:rPr>
-                <w:rFonts w:ascii="Times New Roman" w:hAnsi="Times New Roman" w:cs="Times New Roman" w:eastAsia="Times New Roman"/>
-                <w:b w:val="0"/>
-                <w:i w:val="0"/>
-                <w:sz w:val="20"/>
-              </w:rPr>
-              <w:t>—</w:t>
-            </w:r>
-          </w:p>
-        </w:tc>
       </w:tr>
       <w:tr>
         <w:trPr>
@@ -8308,7 +7841,7 @@
         </w:trPr>
         <w:tc>
           <w:tcPr>
-            <w:tcW w:type="dxa" w:w="3515"/>
+            <w:tcW w:type="dxa" w:w="3402"/>
             <w:tcBorders>
               <w:top w:val="single" w:sz="4" w:space="0" w:color="000000"/>
               <w:left w:val="single" w:sz="4" w:space="0" w:color="000000"/>
@@ -8391,7 +7924,7 @@
         </w:tc>
         <w:tc>
           <w:tcPr>
-            <w:tcW w:type="dxa" w:w="1814"/>
+            <w:tcW w:type="dxa" w:w="1984"/>
             <w:tcBorders>
               <w:top w:val="single" w:sz="4" w:space="0" w:color="000000"/>
               <w:left w:val="single" w:sz="4" w:space="0" w:color="000000"/>
@@ -8418,7 +7951,7 @@
         </w:tc>
         <w:tc>
           <w:tcPr>
-            <w:tcW w:type="dxa" w:w="1814"/>
+            <w:tcW w:type="dxa" w:w="1984"/>
             <w:tcBorders>
               <w:top w:val="single" w:sz="4" w:space="0" w:color="000000"/>
               <w:left w:val="single" w:sz="4" w:space="0" w:color="000000"/>
@@ -8440,33 +7973,6 @@
                 <w:sz w:val="20"/>
               </w:rPr>
               <w:t>5,635</w:t>
-            </w:r>
-          </w:p>
-        </w:tc>
-        <w:tc>
-          <w:tcPr>
-            <w:tcW w:type="dxa" w:w="1814"/>
-            <w:tcBorders>
-              <w:top w:val="single" w:sz="4" w:space="0" w:color="000000"/>
-              <w:left w:val="single" w:sz="4" w:space="0" w:color="000000"/>
-              <w:bottom w:val="single" w:sz="4" w:space="0" w:color="000000"/>
-              <w:right w:val="single" w:sz="4" w:space="0" w:color="000000"/>
-            </w:tcBorders>
-          </w:tcPr>
-          <w:p>
-            <w:pPr>
-              <w:keepNext w:val="0"/>
-              <w:spacing w:line="240" w:lineRule="auto" w:after="20"/>
-              <w:jc w:val="center"/>
-            </w:pPr>
-            <w:r>
-              <w:rPr>
-                <w:rFonts w:ascii="Times New Roman" w:hAnsi="Times New Roman" w:cs="Times New Roman" w:eastAsia="Times New Roman"/>
-                <w:b w:val="0"/>
-                <w:i w:val="0"/>
-                <w:sz w:val="20"/>
-              </w:rPr>
-              <w:t>—</w:t>
             </w:r>
           </w:p>
         </w:tc>
@@ -8761,18 +8267,10 @@
       <w:r>
         <w:rPr>
           <w:rFonts w:ascii="Times New Roman" w:hAnsi="Times New Roman" w:cs="Times New Roman" w:eastAsia="Times New Roman"/>
-          <w:b/>
-          <w:i w:val="0"/>
-        </w:rPr>
-        <w:t>Eksik kalan noktalar.</w:t>
-      </w:r>
-      <w:r>
-        <w:rPr>
-          <w:rFonts w:ascii="Times New Roman" w:hAnsi="Times New Roman" w:cs="Times New Roman" w:eastAsia="Times New Roman"/>
           <w:b w:val="0"/>
           <w:i w:val="0"/>
         </w:rPr>
-        <w:t xml:space="preserve"> Bu deneyde laboratuvar ölçümü yapılmadığı için ölçüm sütunları boştur. Teorik değerler SPICE sonuçlarıyla doğrulanmıştır; ölçülen değerlerle karşılaştırma ve hata payı yorumu, ölçümler yapıldıktan sonra eklenmelidir.</w:t>
+        <w:t>Bu çalışmadaki değerler teorik hesaba ve SPICE simülasyonuna dayanmaktadır.</w:t>
       </w:r>
     </w:p>
     <w:p>

</xml_diff>